<commit_message>
chore(examples): re-render the committed Word preview
CommittedAssetDriftTest held the committed previews against what the catalogue
renders, and the Word one had moved: this branch gives a container's fill and
borders, a styles part and real list numbering to the DOCX export, so the same
example produces a different document. The guard names the fix — re-render the
file, or revert what moved it — and the change is intended, so the file is
re-rendered.

Only the DOCX. The PDF beside it differs byte-for-byte on every run through its
time-seeded /ID, which AssetContent drops, so the guard did not flag it and
committing it would be churn.

Verification: ./mvnw -B -ntp test -Dtest=CommittedAssetDriftTest -f
examples/pom.xml, 3 tests, BUILD SUCCESS. Regenerated through
WordExportExample after installing core, render-pdf, render-docx, render-pptx
and templates, since the examples module resolves them from the local
repository rather than the reactor.
</commit_message>
<xml_diff>
--- a/assets/readme/examples/word-export-companion.docx
+++ b/assets/readme/examples/word-export-companion.docx
@@ -8,7 +8,6 @@
       </w:pPr>
       <w:r>
         <w:rPr>
-          <w:rFonts w:ascii="Helvetica" w:hAnsi="Helvetica" w:cs="Helvetica" w:eastAsia="Helvetica"/>
           <w:sz w:val="40"/>
           <w:szCs w:val="40"/>
           <w:color w:val="142D50"/>
@@ -24,7 +23,6 @@
       </w:pPr>
       <w:r>
         <w:rPr>
-          <w:rFonts w:ascii="Helvetica" w:hAnsi="Helvetica" w:cs="Helvetica" w:eastAsia="Helvetica"/>
           <w:sz w:val="28"/>
           <w:szCs w:val="28"/>
           <w:color w:val="000000"/>
@@ -33,7 +31,6 @@
       </w:r>
       <w:r>
         <w:rPr>
-          <w:rFonts w:ascii="Helvetica" w:hAnsi="Helvetica" w:cs="Helvetica" w:eastAsia="Helvetica"/>
           <w:sz w:val="28"/>
           <w:szCs w:val="28"/>
           <w:color w:val="000000"/>
@@ -44,7 +41,6 @@
       </w:r>
       <w:r>
         <w:rPr>
-          <w:rFonts w:ascii="Helvetica" w:hAnsi="Helvetica" w:cs="Helvetica" w:eastAsia="Helvetica"/>
           <w:sz w:val="28"/>
           <w:szCs w:val="28"/>
           <w:color w:val="000000"/>
@@ -53,7 +49,6 @@
       </w:r>
       <w:r>
         <w:rPr>
-          <w:rFonts w:ascii="Helvetica" w:hAnsi="Helvetica" w:cs="Helvetica" w:eastAsia="Helvetica"/>
           <w:sz w:val="28"/>
           <w:szCs w:val="28"/>
           <w:color w:val="000000"/>
@@ -64,7 +59,6 @@
       </w:r>
       <w:r>
         <w:rPr>
-          <w:rFonts w:ascii="Helvetica" w:hAnsi="Helvetica" w:cs="Helvetica" w:eastAsia="Helvetica"/>
           <w:sz w:val="28"/>
           <w:szCs w:val="28"/>
           <w:color w:val="000000"/>
@@ -73,7 +67,6 @@
       </w:r>
       <w:r>
         <w:rPr>
-          <w:rFonts w:ascii="Helvetica" w:hAnsi="Helvetica" w:cs="Helvetica" w:eastAsia="Helvetica"/>
           <w:sz w:val="28"/>
           <w:szCs w:val="28"/>
           <w:color w:val="000000"/>
@@ -84,7 +77,6 @@
       </w:r>
       <w:r>
         <w:rPr>
-          <w:rFonts w:ascii="Helvetica" w:hAnsi="Helvetica" w:cs="Helvetica" w:eastAsia="Helvetica"/>
           <w:sz w:val="28"/>
           <w:szCs w:val="28"/>
           <w:color w:val="C4994C"/>
@@ -93,7 +85,6 @@
       </w:r>
       <w:r>
         <w:rPr>
-          <w:rFonts w:ascii="Helvetica" w:hAnsi="Helvetica" w:cs="Helvetica" w:eastAsia="Helvetica"/>
           <w:sz w:val="28"/>
           <w:szCs w:val="28"/>
           <w:color w:val="14505F"/>
@@ -104,7 +95,6 @@
       </w:r>
       <w:r>
         <w:rPr>
-          <w:rFonts w:ascii="Helvetica" w:hAnsi="Helvetica" w:cs="Helvetica" w:eastAsia="Helvetica"/>
           <w:sz w:val="28"/>
           <w:szCs w:val="28"/>
           <w:color w:val="000000"/>
@@ -118,7 +108,6 @@
       </w:pPr>
       <w:r>
         <w:rPr>
-          <w:rFonts w:ascii="Helvetica" w:hAnsi="Helvetica" w:cs="Helvetica" w:eastAsia="Helvetica"/>
           <w:sz w:val="26"/>
           <w:szCs w:val="26"/>
           <w:color w:val="222632"/>
@@ -129,67 +118,91 @@
       </w:r>
     </w:p>
     <w:p>
-      <w:r>
-        <w:rPr>
-          <w:rFonts w:ascii="Helvetica" w:hAnsi="Helvetica" w:cs="Helvetica" w:eastAsia="Helvetica"/>
+      <w:pPr>
+        <w:numPr>
+          <w:ilvl w:val="0"/>
+          <w:numId w:val="1"/>
+        </w:numPr>
+      </w:pPr>
+      <w:r>
+        <w:rPr>
           <w:sz w:val="22"/>
           <w:szCs w:val="22"/>
           <w:color w:val="222632"/>
         </w:rPr>
-        <w:t>- Flat items use the list marker</w:t>
-      </w:r>
-    </w:p>
-    <w:p>
-      <w:r>
-        <w:rPr>
-          <w:rFonts w:ascii="Helvetica" w:hAnsi="Helvetica" w:cs="Helvetica" w:eastAsia="Helvetica"/>
+        <w:t>Flat items use the list marker</w:t>
+      </w:r>
+    </w:p>
+    <w:p>
+      <w:pPr>
+        <w:numPr>
+          <w:ilvl w:val="0"/>
+          <w:numId w:val="1"/>
+        </w:numPr>
+      </w:pPr>
+      <w:r>
+        <w:rPr>
           <w:sz w:val="22"/>
           <w:szCs w:val="22"/>
           <w:color w:val="222632"/>
         </w:rPr>
-        <w:t>- Word gets one paragraph per item</w:t>
-      </w:r>
-    </w:p>
-    <w:p>
-      <w:r>
-        <w:rPr>
-          <w:rFonts w:ascii="Helvetica" w:hAnsi="Helvetica" w:cs="Helvetica" w:eastAsia="Helvetica"/>
+        <w:t>Word gets one paragraph per item</w:t>
+      </w:r>
+    </w:p>
+    <w:p>
+      <w:pPr>
+        <w:numPr>
+          <w:ilvl w:val="0"/>
+          <w:numId w:val="2"/>
+        </w:numPr>
+      </w:pPr>
+      <w:r>
+        <w:rPr>
           <w:sz w:val="22"/>
           <w:szCs w:val="22"/>
           <w:color w:val="222632"/>
         </w:rPr>
-        <w:t>• Nested authoring</w:t>
-      </w:r>
-    </w:p>
-    <w:p>
-      <w:r>
-        <w:rPr>
-          <w:rFonts w:ascii="Helvetica" w:hAnsi="Helvetica" w:cs="Helvetica" w:eastAsia="Helvetica"/>
+        <w:t>Nested authoring</w:t>
+      </w:r>
+    </w:p>
+    <w:p>
+      <w:pPr>
+        <w:numPr>
+          <w:ilvl w:val="1"/>
+          <w:numId w:val="2"/>
+        </w:numPr>
+      </w:pPr>
+      <w:r>
+        <w:rPr>
           <w:sz w:val="22"/>
           <w:szCs w:val="22"/>
           <w:color w:val="222632"/>
         </w:rPr>
-        <w:t xml:space="preserve">  ◦ Two spaces of indent per depth in Word</w:t>
-      </w:r>
-    </w:p>
-    <w:p>
-      <w:r>
-        <w:rPr>
-          <w:rFonts w:ascii="Helvetica" w:hAnsi="Helvetica" w:cs="Helvetica" w:eastAsia="Helvetica"/>
+        <w:t>Two spaces of indent per depth in Word</w:t>
+      </w:r>
+    </w:p>
+    <w:p>
+      <w:pPr>
+        <w:numPr>
+          <w:ilvl w:val="2"/>
+          <w:numId w:val="2"/>
+        </w:numPr>
+      </w:pPr>
+      <w:r>
+        <w:rPr>
           <w:sz w:val="22"/>
           <w:szCs w:val="22"/>
           <w:color w:val="222632"/>
         </w:rPr>
-        <w:t xml:space="preserve">    ▪ Custom markers survive the export</w:t>
-      </w:r>
-    </w:p>
-    <w:p>
-      <w:pPr>
-        <w:jc w:val="left"/>
-      </w:pPr>
-      <w:r>
-        <w:rPr>
-          <w:rFonts w:ascii="Helvetica" w:hAnsi="Helvetica" w:cs="Helvetica" w:eastAsia="Helvetica"/>
+        <w:t>Custom markers survive the export</w:t>
+      </w:r>
+    </w:p>
+    <w:p>
+      <w:pPr>
+        <w:jc w:val="left"/>
+      </w:pPr>
+      <w:r>
+        <w:rPr>
           <w:sz w:val="26"/>
           <w:szCs w:val="26"/>
           <w:color w:val="222632"/>
@@ -456,7 +469,6 @@
       </w:pPr>
       <w:r>
         <w:rPr>
-          <w:rFonts w:ascii="Helvetica" w:hAnsi="Helvetica" w:cs="Helvetica" w:eastAsia="Helvetica"/>
           <w:sz w:val="26"/>
           <w:szCs w:val="26"/>
           <w:color w:val="222632"/>
@@ -471,11 +483,17 @@
         <w:tblW w:w="0" w:type="auto"/>
         <w:tblBorders>
           <w:top w:val="single"/>
+          <w:top w:val="none"/>
           <w:left w:val="single"/>
+          <w:left w:val="none"/>
           <w:bottom w:val="single"/>
+          <w:bottom w:val="none"/>
           <w:right w:val="single"/>
+          <w:right w:val="none"/>
           <w:insideH w:val="single"/>
+          <w:insideH w:val="none"/>
           <w:insideV w:val="single"/>
+          <w:insideV w:val="none"/>
         </w:tblBorders>
       </w:tblPr>
       <w:tr>
@@ -486,7 +504,6 @@
             </w:pPr>
             <w:r>
               <w:rPr>
-                <w:rFonts w:ascii="Helvetica" w:hAnsi="Helvetica" w:cs="Helvetica" w:eastAsia="Helvetica"/>
                 <w:sz w:val="22"/>
                 <w:szCs w:val="22"/>
                 <w:color w:val="222632"/>
@@ -502,7 +519,6 @@
             </w:pPr>
             <w:r>
               <w:rPr>
-                <w:rFonts w:ascii="Helvetica" w:hAnsi="Helvetica" w:cs="Helvetica" w:eastAsia="Helvetica"/>
                 <w:sz w:val="22"/>
                 <w:szCs w:val="22"/>
                 <w:color w:val="222632"/>
@@ -519,7 +535,6 @@
       </w:pPr>
       <w:r>
         <w:rPr>
-          <w:rFonts w:ascii="Helvetica" w:hAnsi="Helvetica" w:cs="Helvetica" w:eastAsia="Helvetica"/>
           <w:sz w:val="26"/>
           <w:szCs w:val="26"/>
           <w:color w:val="222632"/>
@@ -545,7 +560,7 @@
                     </pic:cNvPicPr>
                   </pic:nvPicPr>
                   <pic:blipFill>
-                    <a:blip r:embed="rId2"/>
+                    <a:blip r:embed="rId4"/>
                     <a:stretch>
                       <a:fillRect/>
                     </a:stretch>
@@ -577,7 +592,6 @@
       </w:pPr>
       <w:r>
         <w:rPr>
-          <w:rFonts w:ascii="Helvetica" w:hAnsi="Helvetica" w:cs="Helvetica" w:eastAsia="Helvetica"/>
           <w:sz w:val="26"/>
           <w:szCs w:val="26"/>
           <w:color w:val="222632"/>
@@ -593,10 +607,6 @@
       </w:pPr>
       <w:r>
         <w:rPr>
-          <w:rFonts w:ascii="Helvetica" w:hAnsi="Helvetica" w:cs="Helvetica" w:eastAsia="Helvetica"/>
-          <w:sz w:val="20"/>
-          <w:szCs w:val="20"/>
-          <w:color w:val="666A76"/>
           <w:i w:val="on"/>
           <w:iCs w:val="on"/>
         </w:rPr>
@@ -737,7 +747,6 @@
       </w:pPr>
       <w:r>
         <w:rPr>
-          <w:rFonts w:ascii="Helvetica" w:hAnsi="Helvetica" w:cs="Helvetica" w:eastAsia="Helvetica"/>
           <w:sz w:val="26"/>
           <w:szCs w:val="26"/>
           <w:color w:val="222632"/>
@@ -753,10 +762,6 @@
       </w:pPr>
       <w:r>
         <w:rPr>
-          <w:rFonts w:ascii="Helvetica" w:hAnsi="Helvetica" w:cs="Helvetica" w:eastAsia="Helvetica"/>
-          <w:sz w:val="20"/>
-          <w:szCs w:val="20"/>
-          <w:color w:val="666A76"/>
           <w:i w:val="on"/>
           <w:iCs w:val="on"/>
         </w:rPr>
@@ -769,7 +774,6 @@
       </w:pPr>
       <w:r>
         <w:rPr>
-          <w:rFonts w:ascii="Helvetica" w:hAnsi="Helvetica" w:cs="Helvetica" w:eastAsia="Helvetica"/>
           <w:sz w:val="40"/>
           <w:szCs w:val="40"/>
           <w:color w:val="FFFFFF"/>
@@ -785,4 +789,79 @@
     </w:sectPr>
   </w:body>
 </w:document>
+</file>
+
+<file path=word/numbering.xml><?xml version="1.0" encoding="utf-8"?>
+<w:numbering xmlns:w="http://schemas.openxmlformats.org/wordprocessingml/2006/main">
+  <w:abstractNum w:abstractNumId="0">
+    <w:lvl w:ilvl="0">
+      <w:start w:val="1"/>
+      <w:numFmt w:val="bullet"/>
+      <w:lvlText w:val="-"/>
+      <w:lvlJc w:val="left"/>
+      <w:pPr>
+        <w:ind w:left="180" w:hanging="180"/>
+      </w:pPr>
+    </w:lvl>
+  </w:abstractNum>
+  <w:abstractNum w:abstractNumId="1">
+    <w:lvl w:ilvl="0">
+      <w:start w:val="1"/>
+      <w:numFmt w:val="bullet"/>
+      <w:lvlText w:val="•"/>
+      <w:lvlJc w:val="left"/>
+      <w:pPr>
+        <w:ind w:left="180" w:hanging="180"/>
+      </w:pPr>
+    </w:lvl>
+    <w:lvl w:ilvl="1">
+      <w:start w:val="1"/>
+      <w:numFmt w:val="bullet"/>
+      <w:lvlText w:val="◦"/>
+      <w:lvlJc w:val="left"/>
+      <w:pPr>
+        <w:ind w:left="300" w:hanging="180"/>
+      </w:pPr>
+    </w:lvl>
+    <w:lvl w:ilvl="2">
+      <w:start w:val="1"/>
+      <w:numFmt w:val="bullet"/>
+      <w:lvlText w:val="▪"/>
+      <w:lvlJc w:val="left"/>
+      <w:pPr>
+        <w:ind w:left="420" w:hanging="180"/>
+      </w:pPr>
+    </w:lvl>
+  </w:abstractNum>
+  <w:num w:numId="1">
+    <w:abstractNumId w:val="0"/>
+  </w:num>
+  <w:num w:numId="2">
+    <w:abstractNumId w:val="1"/>
+  </w:num>
+</w:numbering>
+</file>
+
+<file path=word/styles.xml><?xml version="1.0" encoding="utf-8"?>
+<w:styles xmlns:w="http://schemas.openxmlformats.org/wordprocessingml/2006/main">
+  <w:docDefaults>
+    <w:rPrDefault>
+      <w:rPr>
+        <w:rFonts w:ascii="Helvetica" w:hAnsi="Helvetica" w:cs="Helvetica" w:eastAsia="Helvetica"/>
+        <w:sz w:val="20"/>
+        <w:szCs w:val="20"/>
+        <w:color w:val="666A76"/>
+      </w:rPr>
+    </w:rPrDefault>
+  </w:docDefaults>
+  <w:style w:type="paragraph" w:styleId="Normal" w:default="true">
+    <w:name w:val="Normal"/>
+    <w:rPr>
+      <w:rFonts w:ascii="Helvetica" w:hAnsi="Helvetica" w:cs="Helvetica" w:eastAsia="Helvetica"/>
+      <w:sz w:val="20"/>
+      <w:szCs w:val="20"/>
+      <w:color w:val="666A76"/>
+    </w:rPr>
+  </w:style>
+</w:styles>
 </file>
</xml_diff>

<commit_message>
chore(examples): re-render the committed Word preview again
CommittedAssetDriftTest went red on word-export-companion.docx: three
commits landed after the last re-render -- a table stating its width, a
row carrier writing each border once, and a row's cells taking the
slots the layout gives them -- and each of them changes the bytes of the
document the example produces.

The reactor gate does not cover this. The examples module is outside it
and resolves the engine from the local repository, so a change to the
export is invisible there until CI runs the examples job.

Only the DOCX. The PDF beside it differs on every run through its
time-seeded /ID, which the comparison drops, so committing it would be
churn.

Verification: ./mvnw -B -ntp test -f examples/pom.xml, 93 tests, BUILD
SUCCESS, after installing core, render-pdf, render-docx, render-pptx and
templates and regenerating through WordExportExample.
</commit_message>
<xml_diff>
--- a/assets/readme/examples/word-export-companion.docx
+++ b/assets/readme/examples/word-export-companion.docx
@@ -480,24 +480,30 @@
     </w:p>
     <w:tbl>
       <w:tblPr>
-        <w:tblW w:w="0" w:type="auto"/>
+        <w:tblW w:w="9980" w:type="dxa"/>
         <w:tblBorders>
-          <w:top w:val="single"/>
           <w:top w:val="none"/>
-          <w:left w:val="single"/>
           <w:left w:val="none"/>
-          <w:bottom w:val="single"/>
           <w:bottom w:val="none"/>
-          <w:right w:val="single"/>
           <w:right w:val="none"/>
-          <w:insideH w:val="single"/>
           <w:insideH w:val="none"/>
-          <w:insideV w:val="single"/>
           <w:insideV w:val="none"/>
         </w:tblBorders>
+        <w:tblLayout w:type="fixed"/>
       </w:tblPr>
-      <w:tr>
-        <w:tc>
+      <w:tblGrid>
+        <w:gridCol w:w="5130"/>
+        <w:gridCol w:w="4850"/>
+      </w:tblGrid>
+      <w:tr>
+        <w:tc>
+          <w:tcPr>
+            <w:tcW w:type="dxa" w:w="5130"/>
+            <w:tcMar>
+              <w:left w:type="dxa" w:w="0"/>
+              <w:right w:type="dxa" w:w="280"/>
+            </w:tcMar>
+          </w:tcPr>
           <w:p>
             <w:pPr>
               <w:jc w:val="left"/>
@@ -513,6 +519,13 @@
           </w:p>
         </w:tc>
         <w:tc>
+          <w:tcPr>
+            <w:tcW w:type="dxa" w:w="4850"/>
+            <w:tcMar>
+              <w:left w:type="dxa" w:w="0"/>
+              <w:right w:type="dxa" w:w="0"/>
+            </w:tcMar>
+          </w:tcPr>
           <w:p>
             <w:pPr>
               <w:jc w:val="left"/>

</xml_diff>

<commit_message>
chore(examples): re-render the committed Word preview for the layout work
This branch states a measured line height on every paragraph, carries the space a block holds above and below itself, and writes a grid the layout resolved, so the same example produces a different document than the one the base carries.

Verification: ./mvnw -B -ntp test -f examples/pom.xml, 93 tests, BUILD SUCCESS.
</commit_message>
<xml_diff>
--- a/assets/readme/examples/word-export-companion.docx
+++ b/assets/readme/examples/word-export-companion.docx
@@ -4,6 +4,7 @@
   <w:body>
     <w:p>
       <w:pPr>
+        <w:spacing w:lineRule="exact" w:line="370"/>
         <w:jc w:val="left"/>
       </w:pPr>
       <w:r>
@@ -19,6 +20,7 @@
     </w:p>
     <w:p>
       <w:pPr>
+        <w:spacing w:lineRule="exact" w:line="259"/>
         <w:jc w:val="left"/>
       </w:pPr>
       <w:r>
@@ -104,6 +106,7 @@
     </w:p>
     <w:p>
       <w:pPr>
+        <w:spacing w:lineRule="exact" w:line="241"/>
         <w:jc w:val="left"/>
       </w:pPr>
       <w:r>
@@ -123,6 +126,7 @@
           <w:ilvl w:val="0"/>
           <w:numId w:val="1"/>
         </w:numPr>
+        <w:spacing w:lineRule="exact" w:line="203"/>
       </w:pPr>
       <w:r>
         <w:rPr>
@@ -139,6 +143,7 @@
           <w:ilvl w:val="0"/>
           <w:numId w:val="1"/>
         </w:numPr>
+        <w:spacing w:lineRule="exact" w:line="203"/>
       </w:pPr>
       <w:r>
         <w:rPr>
@@ -155,6 +160,7 @@
           <w:ilvl w:val="0"/>
           <w:numId w:val="2"/>
         </w:numPr>
+        <w:spacing w:lineRule="exact" w:line="203"/>
       </w:pPr>
       <w:r>
         <w:rPr>
@@ -171,6 +177,7 @@
           <w:ilvl w:val="1"/>
           <w:numId w:val="2"/>
         </w:numPr>
+        <w:spacing w:lineRule="exact" w:line="203"/>
       </w:pPr>
       <w:r>
         <w:rPr>
@@ -187,6 +194,7 @@
           <w:ilvl w:val="2"/>
           <w:numId w:val="2"/>
         </w:numPr>
+        <w:spacing w:lineRule="exact" w:line="203"/>
       </w:pPr>
       <w:r>
         <w:rPr>
@@ -199,6 +207,7 @@
     </w:p>
     <w:p>
       <w:pPr>
+        <w:spacing w:lineRule="exact" w:line="241"/>
         <w:jc w:val="left"/>
       </w:pPr>
       <w:r>
@@ -214,7 +223,7 @@
     </w:p>
     <w:tbl>
       <w:tblPr>
-        <w:tblW w:w="0" w:type="auto"/>
+        <w:tblW w:w="3203" w:type="dxa"/>
         <w:tblBorders>
           <w:top w:val="single"/>
           <w:left w:val="single"/>
@@ -223,7 +232,13 @@
           <w:insideH w:val="single"/>
           <w:insideV w:val="single"/>
         </w:tblBorders>
+        <w:tblLayout w:type="fixed"/>
       </w:tblPr>
+      <w:tblGrid>
+        <w:gridCol w:w="1109"/>
+        <w:gridCol w:w="1281"/>
+        <w:gridCol w:w="813"/>
+      </w:tblGrid>
       <w:tr>
         <w:tc>
           <w:tcPr>
@@ -465,6 +480,7 @@
     </w:tbl>
     <w:p>
       <w:pPr>
+        <w:spacing w:lineRule="exact" w:line="241"/>
         <w:jc w:val="left"/>
       </w:pPr>
       <w:r>
@@ -506,6 +522,7 @@
           </w:tcPr>
           <w:p>
             <w:pPr>
+              <w:spacing w:lineRule="exact" w:line="203"/>
               <w:jc w:val="left"/>
             </w:pPr>
             <w:r>
@@ -528,6 +545,7 @@
           </w:tcPr>
           <w:p>
             <w:pPr>
+              <w:spacing w:lineRule="exact" w:line="203"/>
               <w:jc w:val="left"/>
             </w:pPr>
             <w:r>
@@ -544,6 +562,7 @@
     </w:tbl>
     <w:p>
       <w:pPr>
+        <w:spacing w:lineRule="exact" w:line="241"/>
         <w:jc w:val="left"/>
       </w:pPr>
       <w:r>
@@ -601,6 +620,7 @@
     </w:p>
     <w:p>
       <w:pPr>
+        <w:spacing w:lineRule="exact" w:line="241"/>
         <w:jc w:val="left"/>
       </w:pPr>
       <w:r>
@@ -616,6 +636,7 @@
     </w:p>
     <w:p>
       <w:pPr>
+        <w:spacing w:lineRule="exact" w:line="185"/>
         <w:jc w:val="left"/>
       </w:pPr>
       <w:r>
@@ -756,6 +777,7 @@
     </w:tbl>
     <w:p>
       <w:pPr>
+        <w:spacing w:lineRule="exact" w:line="241"/>
         <w:jc w:val="left"/>
       </w:pPr>
       <w:r>
@@ -771,6 +793,7 @@
     </w:p>
     <w:p>
       <w:pPr>
+        <w:spacing w:lineRule="exact" w:line="185"/>
         <w:jc w:val="left"/>
       </w:pPr>
       <w:r>
@@ -783,6 +806,7 @@
     </w:p>
     <w:p>
       <w:pPr>
+        <w:spacing w:lineRule="exact" w:line="370"/>
         <w:jc w:val="center"/>
       </w:pPr>
       <w:r>

</xml_diff>

<commit_message>
fix(docx): give a picture and a list the space they hold around themselves
Neither wrote its own box. On the probe corpus an image holding 12pt at
each edge ran straight into the heading under it — 24pt short of the page
— and a four-item checklist came out 13pt short, because the list's own
padding and its itemSpacing both went unwritten.

A picture's paragraph is the picture's block, so the node's margin and
padding are written on it like any other block's. A list hands its edges
to the paragraphs around it the way a container does, and the gap it puts
between items becomes the space above each item after the first — the
same gap every other block goes through, so nothing is written twice.

The item gap is per list and restored afterwards, because a list can hold
a list and the inner one's spacing must not outlive it.

Measured through LibreOffice against the reference PDF, the corpus's
second page goes from 37pt of drift to 0.4, and its first page holds
within 2pt.
</commit_message>
<xml_diff>
--- a/assets/readme/examples/word-export-companion.docx
+++ b/assets/readme/examples/word-export-companion.docx
@@ -177,7 +177,7 @@
           <w:ilvl w:val="1"/>
           <w:numId w:val="2"/>
         </w:numPr>
-        <w:spacing w:lineRule="exact" w:line="203"/>
+        <w:spacing w:before="40" w:lineRule="exact" w:line="203"/>
       </w:pPr>
       <w:r>
         <w:rPr>
@@ -194,7 +194,7 @@
           <w:ilvl w:val="2"/>
           <w:numId w:val="2"/>
         </w:numPr>
-        <w:spacing w:lineRule="exact" w:line="203"/>
+        <w:spacing w:before="40" w:lineRule="exact" w:line="203"/>
       </w:pPr>
       <w:r>
         <w:rPr>
@@ -667,6 +667,9 @@
       </w:r>
     </w:p>
     <w:p>
+      <w:pPr>
+        <w:spacing/>
+      </w:pPr>
       <w:r>
         <w:drawing>
           <wp:inline distT="0" distR="0" distB="0" distL="0">

</xml_diff>

<commit_message>
fix(docx): give a picture and a list the space they hold around themselves (#713)
Neither wrote its own box. On the probe corpus an image holding 12pt at
each edge ran straight into the heading under it — 24pt short of the page
— and a four-item checklist came out 13pt short, because the list's own
padding and its itemSpacing both went unwritten.

A picture's paragraph is the picture's block, so the node's margin and
padding are written on it like any other block's. A list hands its edges
to the paragraphs around it the way a container does, and the gap it puts
between items becomes the space above each item after the first — the
same gap every other block goes through, so nothing is written twice.

The item gap is per list and restored afterwards, because a list can hold
a list and the inner one's spacing must not outlive it.

Measured through LibreOffice against the reference PDF, the corpus's
second page goes from 37pt of drift to 0.4, and its first page holds
within 2pt.
</commit_message>
<xml_diff>
--- a/assets/readme/examples/word-export-companion.docx
+++ b/assets/readme/examples/word-export-companion.docx
@@ -177,7 +177,7 @@
           <w:ilvl w:val="1"/>
           <w:numId w:val="2"/>
         </w:numPr>
-        <w:spacing w:lineRule="exact" w:line="203"/>
+        <w:spacing w:before="40" w:lineRule="exact" w:line="203"/>
       </w:pPr>
       <w:r>
         <w:rPr>
@@ -194,7 +194,7 @@
           <w:ilvl w:val="2"/>
           <w:numId w:val="2"/>
         </w:numPr>
-        <w:spacing w:lineRule="exact" w:line="203"/>
+        <w:spacing w:before="40" w:lineRule="exact" w:line="203"/>
       </w:pPr>
       <w:r>
         <w:rPr>
@@ -667,6 +667,9 @@
       </w:r>
     </w:p>
     <w:p>
+      <w:pPr>
+        <w:spacing/>
+      </w:pPr>
       <w:r>
         <w:drawing>
           <wp:inline distT="0" distR="0" distB="0" distL="0">

</xml_diff>

<commit_message>
fix(docx): break a table across pages where the layout breaks it
The layout splits a table only between rows, repeats its header rows
on every page it continues on, and never leaves them at the foot of a
page alone. The export stated none of it. Every row the layout placed
is now w:cantSplit, repeatHeader(n) rows are w:tblHeader and keep with
the row under them, and a row of blocks is kept whole the same way.

The committed word-export-companion.docx preview is re-rendered: its
six table rows gain w:cantSplit and nothing else changes.
</commit_message>
<xml_diff>
--- a/assets/readme/examples/word-export-companion.docx
+++ b/assets/readme/examples/word-export-companion.docx
@@ -240,6 +240,9 @@
         <w:gridCol w:w="833"/>
       </w:tblGrid>
       <w:tr>
+        <w:trPr>
+          <w:cantSplit w:val="on"/>
+        </w:trPr>
         <w:tc>
           <w:tcPr>
             <w:tcBorders>
@@ -332,6 +335,9 @@
         </w:tc>
       </w:tr>
       <w:tr>
+        <w:trPr>
+          <w:cantSplit w:val="on"/>
+        </w:trPr>
         <w:tc>
           <w:tcPr>
             <w:tcBorders>
@@ -421,6 +427,9 @@
         </w:tc>
       </w:tr>
       <w:tr>
+        <w:trPr>
+          <w:cantSplit w:val="on"/>
+        </w:trPr>
         <w:tc>
           <w:tcPr>
             <w:tcBorders>
@@ -510,6 +519,9 @@
         </w:tc>
       </w:tr>
       <w:tr>
+        <w:trPr>
+          <w:cantSplit w:val="on"/>
+        </w:trPr>
         <w:tc>
           <w:tcPr>
             <w:tcBorders>
@@ -599,6 +611,9 @@
         </w:tc>
       </w:tr>
       <w:tr>
+        <w:trPr>
+          <w:cantSplit w:val="on"/>
+        </w:trPr>
         <w:tc>
           <w:tcPr>
             <w:tcBorders>
@@ -722,6 +737,9 @@
         <w:gridCol w:w="4850"/>
       </w:tblGrid>
       <w:tr>
+        <w:trPr>
+          <w:cantSplit w:val="on"/>
+        </w:trPr>
         <w:tc>
           <w:tcPr>
             <w:tcW w:type="dxa" w:w="5130"/>

</xml_diff>

<commit_message>
fix(docx): break a table across pages where the layout breaks it (#724)
* fix(docx): break a table across pages where the layout breaks it

The layout splits a table only between rows, repeats its header rows
on every page it continues on, and never leaves them at the foot of a
page alone. The export stated none of it. Every row the layout placed
is now w:cantSplit, repeatHeader(n) rows are w:tblHeader and keep with
the row under them, and a row of blocks is kept whole the same way.

The committed word-export-companion.docx preview is re-rendered: its
six table rows gain w:cantSplit and nothing else changes.

* fix(docx): look a placed row up by the index text the layout wrote

A row name's index was parsed with Integer.parseInt, which throws on a
name that only resembles the pattern. The index is kept as text and a
row is looked up by writing its index the same way, so such a name
matches nothing instead of failing the export.
</commit_message>
<xml_diff>
--- a/assets/readme/examples/word-export-companion.docx
+++ b/assets/readme/examples/word-export-companion.docx
@@ -240,6 +240,9 @@
         <w:gridCol w:w="833"/>
       </w:tblGrid>
       <w:tr>
+        <w:trPr>
+          <w:cantSplit w:val="on"/>
+        </w:trPr>
         <w:tc>
           <w:tcPr>
             <w:tcBorders>
@@ -332,6 +335,9 @@
         </w:tc>
       </w:tr>
       <w:tr>
+        <w:trPr>
+          <w:cantSplit w:val="on"/>
+        </w:trPr>
         <w:tc>
           <w:tcPr>
             <w:tcBorders>
@@ -421,6 +427,9 @@
         </w:tc>
       </w:tr>
       <w:tr>
+        <w:trPr>
+          <w:cantSplit w:val="on"/>
+        </w:trPr>
         <w:tc>
           <w:tcPr>
             <w:tcBorders>
@@ -510,6 +519,9 @@
         </w:tc>
       </w:tr>
       <w:tr>
+        <w:trPr>
+          <w:cantSplit w:val="on"/>
+        </w:trPr>
         <w:tc>
           <w:tcPr>
             <w:tcBorders>
@@ -599,6 +611,9 @@
         </w:tc>
       </w:tr>
       <w:tr>
+        <w:trPr>
+          <w:cantSplit w:val="on"/>
+        </w:trPr>
         <w:tc>
           <w:tcPr>
             <w:tcBorders>
@@ -722,6 +737,9 @@
         <w:gridCol w:w="4850"/>
       </w:tblGrid>
       <w:tr>
+        <w:trPr>
+          <w:cantSplit w:val="on"/>
+        </w:trPr>
         <w:tc>
           <w:tcPr>
             <w:tcW w:type="dxa" w:w="5130"/>

</xml_diff>

<commit_message>
fix(docx): align table cells where the page aligns them
The export read neither half of a cell's textAnchor. Every column a
template right-aligns or centres came out flush left, and since Word's
default is the top of the cell while the engine's is the vertical middle,
a single line beside a taller neighbour sat at the top of its row.

The anchor, cascaded as the layout cascades it, is now w:vAlign on every
cell and w:jc on a text cell's paragraph, with the engine's default when
none is stated: middle left, or middle right for a right-to-left cell,
and DEFAULT at the bottom left as the renderer draws it. A composed cell
takes the vertical half only, as the engine places it.

The committed word-export-companion.docx gains w:vAlign="center" on its
30 cells and nothing else.
</commit_message>
<xml_diff>
--- a/assets/readme/examples/word-export-companion.docx
+++ b/assets/readme/examples/word-export-companion.docx
@@ -258,6 +258,7 @@
               <w:bottom w:type="dxa" w:w="80"/>
               <w:right w:type="dxa" w:w="80"/>
             </w:tcMar>
+            <w:vAlign w:val="center"/>
           </w:tcPr>
           <w:p>
             <w:pPr>
@@ -288,6 +289,7 @@
               <w:bottom w:type="dxa" w:w="80"/>
               <w:right w:type="dxa" w:w="80"/>
             </w:tcMar>
+            <w:vAlign w:val="center"/>
           </w:tcPr>
           <w:p>
             <w:pPr>
@@ -318,6 +320,7 @@
               <w:bottom w:type="dxa" w:w="80"/>
               <w:right w:type="dxa" w:w="80"/>
             </w:tcMar>
+            <w:vAlign w:val="center"/>
           </w:tcPr>
           <w:p>
             <w:pPr>
@@ -352,6 +355,7 @@
               <w:bottom w:type="dxa" w:w="80"/>
               <w:right w:type="dxa" w:w="80"/>
             </w:tcMar>
+            <w:vAlign w:val="center"/>
           </w:tcPr>
           <w:p>
             <w:pPr>
@@ -381,6 +385,7 @@
               <w:bottom w:type="dxa" w:w="80"/>
               <w:right w:type="dxa" w:w="80"/>
             </w:tcMar>
+            <w:vAlign w:val="center"/>
           </w:tcPr>
           <w:p>
             <w:pPr>
@@ -410,6 +415,7 @@
               <w:bottom w:type="dxa" w:w="80"/>
               <w:right w:type="dxa" w:w="80"/>
             </w:tcMar>
+            <w:vAlign w:val="center"/>
           </w:tcPr>
           <w:p>
             <w:pPr>
@@ -444,6 +450,7 @@
               <w:bottom w:type="dxa" w:w="80"/>
               <w:right w:type="dxa" w:w="80"/>
             </w:tcMar>
+            <w:vAlign w:val="center"/>
           </w:tcPr>
           <w:p>
             <w:pPr>
@@ -473,6 +480,7 @@
               <w:bottom w:type="dxa" w:w="80"/>
               <w:right w:type="dxa" w:w="80"/>
             </w:tcMar>
+            <w:vAlign w:val="center"/>
           </w:tcPr>
           <w:p>
             <w:pPr>
@@ -502,6 +510,7 @@
               <w:bottom w:type="dxa" w:w="80"/>
               <w:right w:type="dxa" w:w="80"/>
             </w:tcMar>
+            <w:vAlign w:val="center"/>
           </w:tcPr>
           <w:p>
             <w:pPr>
@@ -536,6 +545,7 @@
               <w:bottom w:type="dxa" w:w="80"/>
               <w:right w:type="dxa" w:w="80"/>
             </w:tcMar>
+            <w:vAlign w:val="center"/>
           </w:tcPr>
           <w:p>
             <w:pPr>
@@ -565,6 +575,7 @@
               <w:bottom w:type="dxa" w:w="80"/>
               <w:right w:type="dxa" w:w="80"/>
             </w:tcMar>
+            <w:vAlign w:val="center"/>
           </w:tcPr>
           <w:p>
             <w:pPr>
@@ -594,6 +605,7 @@
               <w:bottom w:type="dxa" w:w="80"/>
               <w:right w:type="dxa" w:w="80"/>
             </w:tcMar>
+            <w:vAlign w:val="center"/>
           </w:tcPr>
           <w:p>
             <w:pPr>
@@ -628,6 +640,7 @@
               <w:bottom w:type="dxa" w:w="80"/>
               <w:right w:type="dxa" w:w="80"/>
             </w:tcMar>
+            <w:vAlign w:val="center"/>
           </w:tcPr>
           <w:p>
             <w:pPr>
@@ -657,6 +670,7 @@
               <w:bottom w:type="dxa" w:w="80"/>
               <w:right w:type="dxa" w:w="80"/>
             </w:tcMar>
+            <w:vAlign w:val="center"/>
           </w:tcPr>
           <w:p>
             <w:pPr>
@@ -686,6 +700,7 @@
               <w:bottom w:type="dxa" w:w="80"/>
               <w:right w:type="dxa" w:w="80"/>
             </w:tcMar>
+            <w:vAlign w:val="center"/>
           </w:tcPr>
           <w:p>
             <w:pPr>
@@ -899,6 +914,7 @@
               <w:bottom w:type="dxa" w:w="80"/>
               <w:right w:type="dxa" w:w="80"/>
             </w:tcMar>
+            <w:vAlign w:val="center"/>
           </w:tcPr>
           <w:p>
             <w:r>
@@ -919,6 +935,7 @@
               <w:bottom w:type="dxa" w:w="80"/>
               <w:right w:type="dxa" w:w="80"/>
             </w:tcMar>
+            <w:vAlign w:val="center"/>
           </w:tcPr>
           <w:p>
             <w:r>
@@ -939,6 +956,7 @@
               <w:bottom w:type="dxa" w:w="80"/>
               <w:right w:type="dxa" w:w="80"/>
             </w:tcMar>
+            <w:vAlign w:val="center"/>
           </w:tcPr>
           <w:p>
             <w:r>
@@ -961,6 +979,7 @@
               <w:bottom w:type="dxa" w:w="80"/>
               <w:right w:type="dxa" w:w="80"/>
             </w:tcMar>
+            <w:vAlign w:val="center"/>
           </w:tcPr>
           <w:p>
             <w:r>
@@ -981,6 +1000,7 @@
               <w:bottom w:type="dxa" w:w="80"/>
               <w:right w:type="dxa" w:w="80"/>
             </w:tcMar>
+            <w:vAlign w:val="center"/>
           </w:tcPr>
           <w:p>
             <w:r>
@@ -1001,6 +1021,7 @@
               <w:bottom w:type="dxa" w:w="80"/>
               <w:right w:type="dxa" w:w="80"/>
             </w:tcMar>
+            <w:vAlign w:val="center"/>
           </w:tcPr>
           <w:p>
             <w:r>
@@ -1023,6 +1044,7 @@
               <w:bottom w:type="dxa" w:w="80"/>
               <w:right w:type="dxa" w:w="80"/>
             </w:tcMar>
+            <w:vAlign w:val="center"/>
           </w:tcPr>
           <w:p>
             <w:r>
@@ -1043,6 +1065,7 @@
               <w:bottom w:type="dxa" w:w="80"/>
               <w:right w:type="dxa" w:w="80"/>
             </w:tcMar>
+            <w:vAlign w:val="center"/>
           </w:tcPr>
           <w:p>
             <w:r>
@@ -1063,6 +1086,7 @@
               <w:bottom w:type="dxa" w:w="80"/>
               <w:right w:type="dxa" w:w="80"/>
             </w:tcMar>
+            <w:vAlign w:val="center"/>
           </w:tcPr>
           <w:p>
             <w:r>
@@ -1085,6 +1109,7 @@
               <w:bottom w:type="dxa" w:w="80"/>
               <w:right w:type="dxa" w:w="80"/>
             </w:tcMar>
+            <w:vAlign w:val="center"/>
           </w:tcPr>
           <w:p>
             <w:r>
@@ -1105,6 +1130,7 @@
               <w:bottom w:type="dxa" w:w="80"/>
               <w:right w:type="dxa" w:w="80"/>
             </w:tcMar>
+            <w:vAlign w:val="center"/>
           </w:tcPr>
           <w:p>
             <w:r>
@@ -1125,6 +1151,7 @@
               <w:bottom w:type="dxa" w:w="80"/>
               <w:right w:type="dxa" w:w="80"/>
             </w:tcMar>
+            <w:vAlign w:val="center"/>
           </w:tcPr>
           <w:p>
             <w:r>
@@ -1147,6 +1174,7 @@
               <w:bottom w:type="dxa" w:w="80"/>
               <w:right w:type="dxa" w:w="80"/>
             </w:tcMar>
+            <w:vAlign w:val="center"/>
           </w:tcPr>
           <w:p>
             <w:r>
@@ -1167,6 +1195,7 @@
               <w:bottom w:type="dxa" w:w="80"/>
               <w:right w:type="dxa" w:w="80"/>
             </w:tcMar>
+            <w:vAlign w:val="center"/>
           </w:tcPr>
           <w:p>
             <w:r>
@@ -1187,6 +1216,7 @@
               <w:bottom w:type="dxa" w:w="80"/>
               <w:right w:type="dxa" w:w="80"/>
             </w:tcMar>
+            <w:vAlign w:val="center"/>
           </w:tcPr>
           <w:p>
             <w:r>

</xml_diff>

<commit_message>
feat(docx): write horizontal lines and dividers as Word rules
The export dropped every LineNode and standalone ShapeNode, so the rules
a template draws under a heading or between entries were missing from
the Word file. A horizontal line with no transform, and a filled bar no
taller than Word's thickest border with no stroke, radius, gradient or
transform (what addDivider draws), are now Word's own rule: an empty
paragraph whose bottom border is the stroke, in its colour and thickness,
with its ends as the paragraph's indents and the space above and below
the stroke in its box kept. A dash becomes Word's dashed or dotted
border and is reported APPROXIMATED. Vertical and slanted lines and
other shapes are still dropped and reported.

The committed word-export-companion.docx gains its divider and nothing
else. Two report tests that used a horizontal line as their example of a
dropped node now use a vertical one.
</commit_message>
<xml_diff>
--- a/assets/readme/examples/word-export-companion.docx
+++ b/assets/readme/examples/word-export-companion.docx
@@ -1259,6 +1259,15 @@
         </w:rPr>
         <w:t>The divider and the badge below render in the PDF; the semantic export skips pure geometry and writes the badge's text inline instead.</w:t>
       </w:r>
+    </w:p>
+    <w:p>
+      <w:pPr>
+        <w:pBdr>
+          <w:bottom w:val="single" w:sz="16" w:color="C4994C" w:space="0"/>
+        </w:pBdr>
+        <w:spacing w:lineRule="exact" w:line="2"/>
+        <w:ind w:left="0" w:right="1580"/>
+      </w:pPr>
     </w:p>
     <w:p>
       <w:pPr>

</xml_diff>

<commit_message>
fix(docx): write a container's spacing between its children and a spacer as its height alone
The layout puts a section's or a container's spacing between each two
of its children, and the export wrote none of it: a sidebar laid out
with 9pt between its blocks came out with them touching. It is now owed
below one child and written above the next; none before a page break,
and after one the next page starts that far down, as the layout starts
it. Transparent containers, panels and column layers all write it.

A spacer was an empty paragraph at Word's own line height with the
spacer's height on top of it, a line of text taller than the page has
it. Its paragraph is now held to a hairline.

The committed word-export-companion.docx is re-rendered with it.
</commit_message>
<xml_diff>
--- a/assets/readme/examples/word-export-companion.docx
+++ b/assets/readme/examples/word-export-companion.docx
@@ -20,7 +20,7 @@
     </w:p>
     <w:p>
       <w:pPr>
-        <w:spacing w:lineRule="exact" w:line="259"/>
+        <w:spacing w:before="280" w:lineRule="exact" w:line="259"/>
         <w:jc w:val="left"/>
       </w:pPr>
       <w:r>
@@ -106,7 +106,7 @@
     </w:p>
     <w:p>
       <w:pPr>
-        <w:spacing w:lineRule="exact" w:line="241"/>
+        <w:spacing w:before="280" w:lineRule="exact" w:line="241"/>
         <w:jc w:val="left"/>
       </w:pPr>
       <w:r>
@@ -126,7 +126,7 @@
           <w:ilvl w:val="0"/>
           <w:numId w:val="1"/>
         </w:numPr>
-        <w:spacing w:lineRule="exact" w:line="203"/>
+        <w:spacing w:before="280" w:lineRule="exact" w:line="203"/>
       </w:pPr>
       <w:r>
         <w:rPr>
@@ -160,7 +160,7 @@
           <w:ilvl w:val="0"/>
           <w:numId w:val="2"/>
         </w:numPr>
-        <w:spacing w:lineRule="exact" w:line="203"/>
+        <w:spacing w:before="280" w:lineRule="exact" w:line="203"/>
       </w:pPr>
       <w:r>
         <w:rPr>
@@ -207,7 +207,7 @@
     </w:p>
     <w:p>
       <w:pPr>
-        <w:spacing w:lineRule="exact" w:line="241"/>
+        <w:spacing w:before="280" w:lineRule="exact" w:line="241" w:after="280"/>
         <w:jc w:val="left"/>
       </w:pPr>
       <w:r>
@@ -720,7 +720,7 @@
     </w:tbl>
     <w:p>
       <w:pPr>
-        <w:spacing w:lineRule="exact" w:line="241"/>
+        <w:spacing w:before="280" w:lineRule="exact" w:line="241" w:after="280"/>
         <w:jc w:val="left"/>
       </w:pPr>
       <w:r>
@@ -805,7 +805,7 @@
     </w:tbl>
     <w:p>
       <w:pPr>
-        <w:spacing w:lineRule="exact" w:line="241"/>
+        <w:spacing w:before="280" w:lineRule="exact" w:line="241"/>
         <w:jc w:val="left"/>
       </w:pPr>
       <w:r>
@@ -821,7 +821,7 @@
     </w:p>
     <w:p>
       <w:pPr>
-        <w:spacing/>
+        <w:spacing w:before="280"/>
       </w:pPr>
       <w:r>
         <w:drawing>
@@ -866,7 +866,7 @@
     </w:p>
     <w:p>
       <w:pPr>
-        <w:spacing w:lineRule="exact" w:line="241"/>
+        <w:spacing w:before="280" w:lineRule="exact" w:line="241"/>
         <w:jc w:val="left"/>
       </w:pPr>
       <w:r>
@@ -882,7 +882,7 @@
     </w:p>
     <w:p>
       <w:pPr>
-        <w:spacing w:lineRule="exact" w:line="185"/>
+        <w:spacing w:before="280" w:lineRule="exact" w:line="185" w:after="280"/>
         <w:jc w:val="left"/>
       </w:pPr>
       <w:r>
@@ -1233,7 +1233,7 @@
     </w:tbl>
     <w:p>
       <w:pPr>
-        <w:spacing w:lineRule="exact" w:line="241"/>
+        <w:spacing w:before="280" w:lineRule="exact" w:line="241"/>
         <w:jc w:val="left"/>
       </w:pPr>
       <w:r>
@@ -1249,7 +1249,7 @@
     </w:p>
     <w:p>
       <w:pPr>
-        <w:spacing w:lineRule="exact" w:line="185"/>
+        <w:spacing w:before="280" w:lineRule="exact" w:line="185"/>
         <w:jc w:val="left"/>
       </w:pPr>
       <w:r>
@@ -1265,13 +1265,13 @@
         <w:pBdr>
           <w:bottom w:val="single" w:sz="16" w:color="C4994C" w:space="0"/>
         </w:pBdr>
-        <w:spacing w:lineRule="exact" w:line="2"/>
+        <w:spacing w:before="280" w:lineRule="exact" w:line="2"/>
         <w:ind w:left="0" w:right="1580"/>
       </w:pPr>
     </w:p>
     <w:p>
       <w:pPr>
-        <w:spacing w:lineRule="exact" w:line="370"/>
+        <w:spacing w:before="280" w:lineRule="exact" w:line="370"/>
         <w:jc w:val="center"/>
       </w:pPr>
       <w:r>

</xml_diff>

<commit_message>
fix(docx): write a container's spacing between its children and a spacer as its height alone (#750)
The layout puts a section's or a container's spacing between each two
of its children, and the export wrote none of it: a sidebar laid out
with 9pt between its blocks came out with them touching. It is now owed
below one child and written above the next; none before a page break,
and after one the next page starts that far down, as the layout starts
it. Transparent containers, panels and column layers all write it.

A spacer was an empty paragraph at Word's own line height with the
spacer's height on top of it, a line of text taller than the page has
it. Its paragraph is now held to a hairline.

The committed word-export-companion.docx is re-rendered with it.
</commit_message>
<xml_diff>
--- a/assets/readme/examples/word-export-companion.docx
+++ b/assets/readme/examples/word-export-companion.docx
@@ -20,7 +20,7 @@
     </w:p>
     <w:p>
       <w:pPr>
-        <w:spacing w:lineRule="exact" w:line="259"/>
+        <w:spacing w:before="280" w:lineRule="exact" w:line="259"/>
         <w:jc w:val="left"/>
       </w:pPr>
       <w:r>
@@ -106,7 +106,7 @@
     </w:p>
     <w:p>
       <w:pPr>
-        <w:spacing w:lineRule="exact" w:line="241"/>
+        <w:spacing w:before="280" w:lineRule="exact" w:line="241"/>
         <w:jc w:val="left"/>
       </w:pPr>
       <w:r>
@@ -126,7 +126,7 @@
           <w:ilvl w:val="0"/>
           <w:numId w:val="1"/>
         </w:numPr>
-        <w:spacing w:lineRule="exact" w:line="203"/>
+        <w:spacing w:before="280" w:lineRule="exact" w:line="203"/>
       </w:pPr>
       <w:r>
         <w:rPr>
@@ -160,7 +160,7 @@
           <w:ilvl w:val="0"/>
           <w:numId w:val="2"/>
         </w:numPr>
-        <w:spacing w:lineRule="exact" w:line="203"/>
+        <w:spacing w:before="280" w:lineRule="exact" w:line="203"/>
       </w:pPr>
       <w:r>
         <w:rPr>
@@ -207,7 +207,7 @@
     </w:p>
     <w:p>
       <w:pPr>
-        <w:spacing w:lineRule="exact" w:line="241"/>
+        <w:spacing w:before="280" w:lineRule="exact" w:line="241" w:after="280"/>
         <w:jc w:val="left"/>
       </w:pPr>
       <w:r>
@@ -720,7 +720,7 @@
     </w:tbl>
     <w:p>
       <w:pPr>
-        <w:spacing w:lineRule="exact" w:line="241"/>
+        <w:spacing w:before="280" w:lineRule="exact" w:line="241" w:after="280"/>
         <w:jc w:val="left"/>
       </w:pPr>
       <w:r>
@@ -805,7 +805,7 @@
     </w:tbl>
     <w:p>
       <w:pPr>
-        <w:spacing w:lineRule="exact" w:line="241"/>
+        <w:spacing w:before="280" w:lineRule="exact" w:line="241"/>
         <w:jc w:val="left"/>
       </w:pPr>
       <w:r>
@@ -821,7 +821,7 @@
     </w:p>
     <w:p>
       <w:pPr>
-        <w:spacing/>
+        <w:spacing w:before="280"/>
       </w:pPr>
       <w:r>
         <w:drawing>
@@ -866,7 +866,7 @@
     </w:p>
     <w:p>
       <w:pPr>
-        <w:spacing w:lineRule="exact" w:line="241"/>
+        <w:spacing w:before="280" w:lineRule="exact" w:line="241"/>
         <w:jc w:val="left"/>
       </w:pPr>
       <w:r>
@@ -882,7 +882,7 @@
     </w:p>
     <w:p>
       <w:pPr>
-        <w:spacing w:lineRule="exact" w:line="185"/>
+        <w:spacing w:before="280" w:lineRule="exact" w:line="185" w:after="280"/>
         <w:jc w:val="left"/>
       </w:pPr>
       <w:r>
@@ -1233,7 +1233,7 @@
     </w:tbl>
     <w:p>
       <w:pPr>
-        <w:spacing w:lineRule="exact" w:line="241"/>
+        <w:spacing w:before="280" w:lineRule="exact" w:line="241"/>
         <w:jc w:val="left"/>
       </w:pPr>
       <w:r>
@@ -1249,7 +1249,7 @@
     </w:p>
     <w:p>
       <w:pPr>
-        <w:spacing w:lineRule="exact" w:line="185"/>
+        <w:spacing w:before="280" w:lineRule="exact" w:line="185"/>
         <w:jc w:val="left"/>
       </w:pPr>
       <w:r>
@@ -1265,13 +1265,13 @@
         <w:pBdr>
           <w:bottom w:val="single" w:sz="16" w:color="C4994C" w:space="0"/>
         </w:pBdr>
-        <w:spacing w:lineRule="exact" w:line="2"/>
+        <w:spacing w:before="280" w:lineRule="exact" w:line="2"/>
         <w:ind w:left="0" w:right="1580"/>
       </w:pPr>
     </w:p>
     <w:p>
       <w:pPr>
-        <w:spacing w:lineRule="exact" w:line="370"/>
+        <w:spacing w:before="280" w:lineRule="exact" w:line="370"/>
         <w:jc w:val="center"/>
       </w:pPr>
       <w:r>

</xml_diff>

<commit_message>
review-fix: measure the defaults on top of the container spacing
</commit_message>
<xml_diff>
--- a/assets/readme/examples/word-export-companion.docx
+++ b/assets/readme/examples/word-export-companion.docx
@@ -1355,6 +1355,11 @@
         <w:color w:val="666A76"/>
       </w:rPr>
     </w:rPrDefault>
+    <w:pPrDefault>
+      <w:pPr>
+        <w:spacing w:after="0" w:line="240" w:lineRule="auto"/>
+      </w:pPr>
+    </w:pPrDefault>
   </w:docDefaults>
   <w:style w:type="paragraph" w:styleId="Normal" w:default="true">
     <w:name w:val="Normal"/>

</xml_diff>

<commit_message>
fix(docx): state Word's paragraph defaults so it adds no 8pt under every paragraph (#756)
* fix(docx): state Word's paragraph defaults so it adds no 8pt under every paragraph

* review-fix: name the presets Word now sets short, and fail the default tests on what is missing

* review-fix: measure the defaults on top of the container spacing
</commit_message>
<xml_diff>
--- a/assets/readme/examples/word-export-companion.docx
+++ b/assets/readme/examples/word-export-companion.docx
@@ -1355,6 +1355,11 @@
         <w:color w:val="666A76"/>
       </w:rPr>
     </w:rPrDefault>
+    <w:pPrDefault>
+      <w:pPr>
+        <w:spacing w:after="0" w:line="240" w:lineRule="auto"/>
+      </w:pPr>
+    </w:pPrDefault>
   </w:docDefaults>
   <w:style w:type="paragraph" w:styleId="Normal" w:default="true">
     <w:name w:val="Normal"/>

</xml_diff>

<commit_message>
feat(docx): draw shapes, lines and a timeline's rail where the page draws them
</commit_message>
<xml_diff>
--- a/assets/readme/examples/word-export-companion.docx
+++ b/assets/readme/examples/word-export-companion.docx
@@ -879,6 +879,49 @@
         </w:rPr>
         <w:t>Charts fall back to their data</w:t>
       </w:r>
+      <w:r>
+        <w:drawing xmlns:a="http://schemas.openxmlformats.org/drawingml/2006/main" xmlns:wps="http://schemas.microsoft.com/office/word/2010/wordprocessingShape">
+          <wp:anchor distT="0" distB="0" distL="0" distR="0" simplePos="0" relativeHeight="251659264" behindDoc="1" locked="0" layoutInCell="0" allowOverlap="1">
+            <wp:simplePos x="0" y="0"/>
+            <wp:positionH relativeFrom="page">
+              <wp:posOffset>609600</wp:posOffset>
+            </wp:positionH>
+            <wp:positionV relativeFrom="page">
+              <wp:posOffset>6219666</wp:posOffset>
+            </wp:positionV>
+            <wp:extent cx="914400" cy="914400"/>
+            <wp:effectExtent l="0" t="0" r="0" b="0"/>
+            <wp:wrapNone/>
+            <wp:docPr id="100000" name="Drawing 1"/>
+            <wp:cNvGraphicFramePr/>
+            <a:graphic>
+              <a:graphicData uri="http://schemas.microsoft.com/office/word/2010/wordprocessingShape">
+                <wps:wsp>
+                  <wps:cNvSpPr/>
+                  <wps:spPr>
+                    <a:xfrm>
+                      <a:off x="0" y="0"/>
+                      <a:ext cx="914400" cy="914400"/>
+                    </a:xfrm>
+                    <a:prstGeom prst="ellipse">
+                      <a:avLst/>
+                    </a:prstGeom>
+                    <a:solidFill>
+                      <a:srgbClr val="14505F"/>
+                    </a:solidFill>
+                    <a:ln w="15240">
+                      <a:solidFill>
+                        <a:srgbClr val="C4994C"/>
+                      </a:solidFill>
+                    </a:ln>
+                  </wps:spPr>
+                  <wps:bodyPr/>
+                </wps:wsp>
+              </a:graphicData>
+            </a:graphic>
+          </wp:anchor>
+        </w:drawing>
+      </w:r>
     </w:p>
     <w:p>
       <w:pPr>

</xml_diff>

<commit_message>
review-fix: anchor shapes in table rows and at a paragraph's start, report what a drawn shape loses
</commit_message>
<xml_diff>
--- a/assets/readme/examples/word-export-companion.docx
+++ b/assets/readme/examples/word-export-companion.docx
@@ -869,16 +869,6 @@
         <w:spacing w:before="280" w:lineRule="exact" w:line="241"/>
         <w:jc w:val="left"/>
       </w:pPr>
-      <w:r>
-        <w:rPr>
-          <w:sz w:val="26"/>
-          <w:szCs w:val="26"/>
-          <w:color w:val="222632"/>
-          <w:b w:val="on"/>
-          <w:bCs w:val="on"/>
-        </w:rPr>
-        <w:t>Charts fall back to their data</w:t>
-      </w:r>
       <w:r>
         <w:drawing xmlns:a="http://schemas.openxmlformats.org/drawingml/2006/main" xmlns:wps="http://schemas.microsoft.com/office/word/2010/wordprocessingShape">
           <wp:anchor distT="0" distB="0" distL="0" distR="0" simplePos="0" relativeHeight="251659264" behindDoc="1" locked="0" layoutInCell="0" allowOverlap="1">
@@ -922,6 +912,16 @@
           </wp:anchor>
         </w:drawing>
       </w:r>
+      <w:r>
+        <w:rPr>
+          <w:sz w:val="26"/>
+          <w:szCs w:val="26"/>
+          <w:color w:val="222632"/>
+          <w:b w:val="on"/>
+          <w:bCs w:val="on"/>
+        </w:rPr>
+        <w:t>Charts fall back to their data</w:t>
+      </w:r>
     </w:p>
     <w:p>
       <w:pPr>

</xml_diff>

<commit_message>
feat(docx): draw shapes, lines and a timeline's rail where the page draws them (#761)
</commit_message>
<xml_diff>
--- a/assets/readme/examples/word-export-companion.docx
+++ b/assets/readme/examples/word-export-companion.docx
@@ -870,6 +870,49 @@
         <w:jc w:val="left"/>
       </w:pPr>
       <w:r>
+        <w:drawing xmlns:a="http://schemas.openxmlformats.org/drawingml/2006/main" xmlns:wps="http://schemas.microsoft.com/office/word/2010/wordprocessingShape">
+          <wp:anchor distT="0" distB="0" distL="0" distR="0" simplePos="0" relativeHeight="251659264" behindDoc="1" locked="0" layoutInCell="0" allowOverlap="1">
+            <wp:simplePos x="0" y="0"/>
+            <wp:positionH relativeFrom="page">
+              <wp:posOffset>609600</wp:posOffset>
+            </wp:positionH>
+            <wp:positionV relativeFrom="page">
+              <wp:posOffset>6219666</wp:posOffset>
+            </wp:positionV>
+            <wp:extent cx="914400" cy="914400"/>
+            <wp:effectExtent l="0" t="0" r="0" b="0"/>
+            <wp:wrapNone/>
+            <wp:docPr id="100000" name="Drawing 1"/>
+            <wp:cNvGraphicFramePr/>
+            <a:graphic>
+              <a:graphicData uri="http://schemas.microsoft.com/office/word/2010/wordprocessingShape">
+                <wps:wsp>
+                  <wps:cNvSpPr/>
+                  <wps:spPr>
+                    <a:xfrm>
+                      <a:off x="0" y="0"/>
+                      <a:ext cx="914400" cy="914400"/>
+                    </a:xfrm>
+                    <a:prstGeom prst="ellipse">
+                      <a:avLst/>
+                    </a:prstGeom>
+                    <a:solidFill>
+                      <a:srgbClr val="14505F"/>
+                    </a:solidFill>
+                    <a:ln w="15240">
+                      <a:solidFill>
+                        <a:srgbClr val="C4994C"/>
+                      </a:solidFill>
+                    </a:ln>
+                  </wps:spPr>
+                  <wps:bodyPr/>
+                </wps:wsp>
+              </a:graphicData>
+            </a:graphic>
+          </wp:anchor>
+        </w:drawing>
+      </w:r>
+      <w:r>
         <w:rPr>
           <w:sz w:val="26"/>
           <w:szCs w:val="26"/>

</xml_diff>

<commit_message>
review-fix: re-render the Word companion preview
</commit_message>
<xml_diff>
--- a/assets/readme/examples/word-export-companion.docx
+++ b/assets/readme/examples/word-export-companion.docx
@@ -960,6 +960,12 @@
             <w:vAlign w:val="center"/>
           </w:tcPr>
           <w:p>
+            <w:pPr>
+              <w:rPr>
+                <w:sz w:val="28"/>
+                <w:szCs w:val="28"/>
+              </w:rPr>
+            </w:pPr>
             <w:r>
               <w:rPr>
                 <w:sz w:val="28"/>
@@ -981,6 +987,12 @@
             <w:vAlign w:val="center"/>
           </w:tcPr>
           <w:p>
+            <w:pPr>
+              <w:rPr>
+                <w:sz w:val="28"/>
+                <w:szCs w:val="28"/>
+              </w:rPr>
+            </w:pPr>
             <w:r>
               <w:rPr>
                 <w:sz w:val="28"/>
@@ -1002,6 +1014,12 @@
             <w:vAlign w:val="center"/>
           </w:tcPr>
           <w:p>
+            <w:pPr>
+              <w:rPr>
+                <w:sz w:val="28"/>
+                <w:szCs w:val="28"/>
+              </w:rPr>
+            </w:pPr>
             <w:r>
               <w:rPr>
                 <w:sz w:val="28"/>
@@ -1025,6 +1043,12 @@
             <w:vAlign w:val="center"/>
           </w:tcPr>
           <w:p>
+            <w:pPr>
+              <w:rPr>
+                <w:sz w:val="28"/>
+                <w:szCs w:val="28"/>
+              </w:rPr>
+            </w:pPr>
             <w:r>
               <w:rPr>
                 <w:sz w:val="28"/>
@@ -1046,6 +1070,12 @@
             <w:vAlign w:val="center"/>
           </w:tcPr>
           <w:p>
+            <w:pPr>
+              <w:rPr>
+                <w:sz w:val="28"/>
+                <w:szCs w:val="28"/>
+              </w:rPr>
+            </w:pPr>
             <w:r>
               <w:rPr>
                 <w:sz w:val="28"/>
@@ -1067,6 +1097,12 @@
             <w:vAlign w:val="center"/>
           </w:tcPr>
           <w:p>
+            <w:pPr>
+              <w:rPr>
+                <w:sz w:val="28"/>
+                <w:szCs w:val="28"/>
+              </w:rPr>
+            </w:pPr>
             <w:r>
               <w:rPr>
                 <w:sz w:val="28"/>
@@ -1090,6 +1126,12 @@
             <w:vAlign w:val="center"/>
           </w:tcPr>
           <w:p>
+            <w:pPr>
+              <w:rPr>
+                <w:sz w:val="28"/>
+                <w:szCs w:val="28"/>
+              </w:rPr>
+            </w:pPr>
             <w:r>
               <w:rPr>
                 <w:sz w:val="28"/>
@@ -1111,6 +1153,12 @@
             <w:vAlign w:val="center"/>
           </w:tcPr>
           <w:p>
+            <w:pPr>
+              <w:rPr>
+                <w:sz w:val="28"/>
+                <w:szCs w:val="28"/>
+              </w:rPr>
+            </w:pPr>
             <w:r>
               <w:rPr>
                 <w:sz w:val="28"/>
@@ -1132,6 +1180,12 @@
             <w:vAlign w:val="center"/>
           </w:tcPr>
           <w:p>
+            <w:pPr>
+              <w:rPr>
+                <w:sz w:val="28"/>
+                <w:szCs w:val="28"/>
+              </w:rPr>
+            </w:pPr>
             <w:r>
               <w:rPr>
                 <w:sz w:val="28"/>
@@ -1155,6 +1209,12 @@
             <w:vAlign w:val="center"/>
           </w:tcPr>
           <w:p>
+            <w:pPr>
+              <w:rPr>
+                <w:sz w:val="28"/>
+                <w:szCs w:val="28"/>
+              </w:rPr>
+            </w:pPr>
             <w:r>
               <w:rPr>
                 <w:sz w:val="28"/>
@@ -1176,6 +1236,12 @@
             <w:vAlign w:val="center"/>
           </w:tcPr>
           <w:p>
+            <w:pPr>
+              <w:rPr>
+                <w:sz w:val="28"/>
+                <w:szCs w:val="28"/>
+              </w:rPr>
+            </w:pPr>
             <w:r>
               <w:rPr>
                 <w:sz w:val="28"/>
@@ -1197,6 +1263,12 @@
             <w:vAlign w:val="center"/>
           </w:tcPr>
           <w:p>
+            <w:pPr>
+              <w:rPr>
+                <w:sz w:val="28"/>
+                <w:szCs w:val="28"/>
+              </w:rPr>
+            </w:pPr>
             <w:r>
               <w:rPr>
                 <w:sz w:val="28"/>
@@ -1220,6 +1292,12 @@
             <w:vAlign w:val="center"/>
           </w:tcPr>
           <w:p>
+            <w:pPr>
+              <w:rPr>
+                <w:sz w:val="28"/>
+                <w:szCs w:val="28"/>
+              </w:rPr>
+            </w:pPr>
             <w:r>
               <w:rPr>
                 <w:sz w:val="28"/>
@@ -1241,6 +1319,12 @@
             <w:vAlign w:val="center"/>
           </w:tcPr>
           <w:p>
+            <w:pPr>
+              <w:rPr>
+                <w:sz w:val="28"/>
+                <w:szCs w:val="28"/>
+              </w:rPr>
+            </w:pPr>
             <w:r>
               <w:rPr>
                 <w:sz w:val="28"/>
@@ -1262,6 +1346,12 @@
             <w:vAlign w:val="center"/>
           </w:tcPr>
           <w:p>
+            <w:pPr>
+              <w:rPr>
+                <w:sz w:val="28"/>
+                <w:szCs w:val="28"/>
+              </w:rPr>
+            </w:pPr>
             <w:r>
               <w:rPr>
                 <w:sz w:val="28"/>

</xml_diff>

<commit_message>
fix(docx): size a paragraph's mark as its text where the editor sets the line height (#763)
* fix(docx): size a paragraph's mark as its text where the editor sets the line height

* review-fix: set the mark in the text's face too, wherever the line can grow

* review-fix: re-render the Word companion preview
</commit_message>
<xml_diff>
--- a/assets/readme/examples/word-export-companion.docx
+++ b/assets/readme/examples/word-export-companion.docx
@@ -960,6 +960,12 @@
             <w:vAlign w:val="center"/>
           </w:tcPr>
           <w:p>
+            <w:pPr>
+              <w:rPr>
+                <w:sz w:val="28"/>
+                <w:szCs w:val="28"/>
+              </w:rPr>
+            </w:pPr>
             <w:r>
               <w:rPr>
                 <w:sz w:val="28"/>
@@ -981,6 +987,12 @@
             <w:vAlign w:val="center"/>
           </w:tcPr>
           <w:p>
+            <w:pPr>
+              <w:rPr>
+                <w:sz w:val="28"/>
+                <w:szCs w:val="28"/>
+              </w:rPr>
+            </w:pPr>
             <w:r>
               <w:rPr>
                 <w:sz w:val="28"/>
@@ -1002,6 +1014,12 @@
             <w:vAlign w:val="center"/>
           </w:tcPr>
           <w:p>
+            <w:pPr>
+              <w:rPr>
+                <w:sz w:val="28"/>
+                <w:szCs w:val="28"/>
+              </w:rPr>
+            </w:pPr>
             <w:r>
               <w:rPr>
                 <w:sz w:val="28"/>
@@ -1025,6 +1043,12 @@
             <w:vAlign w:val="center"/>
           </w:tcPr>
           <w:p>
+            <w:pPr>
+              <w:rPr>
+                <w:sz w:val="28"/>
+                <w:szCs w:val="28"/>
+              </w:rPr>
+            </w:pPr>
             <w:r>
               <w:rPr>
                 <w:sz w:val="28"/>
@@ -1046,6 +1070,12 @@
             <w:vAlign w:val="center"/>
           </w:tcPr>
           <w:p>
+            <w:pPr>
+              <w:rPr>
+                <w:sz w:val="28"/>
+                <w:szCs w:val="28"/>
+              </w:rPr>
+            </w:pPr>
             <w:r>
               <w:rPr>
                 <w:sz w:val="28"/>
@@ -1067,6 +1097,12 @@
             <w:vAlign w:val="center"/>
           </w:tcPr>
           <w:p>
+            <w:pPr>
+              <w:rPr>
+                <w:sz w:val="28"/>
+                <w:szCs w:val="28"/>
+              </w:rPr>
+            </w:pPr>
             <w:r>
               <w:rPr>
                 <w:sz w:val="28"/>
@@ -1090,6 +1126,12 @@
             <w:vAlign w:val="center"/>
           </w:tcPr>
           <w:p>
+            <w:pPr>
+              <w:rPr>
+                <w:sz w:val="28"/>
+                <w:szCs w:val="28"/>
+              </w:rPr>
+            </w:pPr>
             <w:r>
               <w:rPr>
                 <w:sz w:val="28"/>
@@ -1111,6 +1153,12 @@
             <w:vAlign w:val="center"/>
           </w:tcPr>
           <w:p>
+            <w:pPr>
+              <w:rPr>
+                <w:sz w:val="28"/>
+                <w:szCs w:val="28"/>
+              </w:rPr>
+            </w:pPr>
             <w:r>
               <w:rPr>
                 <w:sz w:val="28"/>
@@ -1132,6 +1180,12 @@
             <w:vAlign w:val="center"/>
           </w:tcPr>
           <w:p>
+            <w:pPr>
+              <w:rPr>
+                <w:sz w:val="28"/>
+                <w:szCs w:val="28"/>
+              </w:rPr>
+            </w:pPr>
             <w:r>
               <w:rPr>
                 <w:sz w:val="28"/>
@@ -1155,6 +1209,12 @@
             <w:vAlign w:val="center"/>
           </w:tcPr>
           <w:p>
+            <w:pPr>
+              <w:rPr>
+                <w:sz w:val="28"/>
+                <w:szCs w:val="28"/>
+              </w:rPr>
+            </w:pPr>
             <w:r>
               <w:rPr>
                 <w:sz w:val="28"/>
@@ -1176,6 +1236,12 @@
             <w:vAlign w:val="center"/>
           </w:tcPr>
           <w:p>
+            <w:pPr>
+              <w:rPr>
+                <w:sz w:val="28"/>
+                <w:szCs w:val="28"/>
+              </w:rPr>
+            </w:pPr>
             <w:r>
               <w:rPr>
                 <w:sz w:val="28"/>
@@ -1197,6 +1263,12 @@
             <w:vAlign w:val="center"/>
           </w:tcPr>
           <w:p>
+            <w:pPr>
+              <w:rPr>
+                <w:sz w:val="28"/>
+                <w:szCs w:val="28"/>
+              </w:rPr>
+            </w:pPr>
             <w:r>
               <w:rPr>
                 <w:sz w:val="28"/>
@@ -1220,6 +1292,12 @@
             <w:vAlign w:val="center"/>
           </w:tcPr>
           <w:p>
+            <w:pPr>
+              <w:rPr>
+                <w:sz w:val="28"/>
+                <w:szCs w:val="28"/>
+              </w:rPr>
+            </w:pPr>
             <w:r>
               <w:rPr>
                 <w:sz w:val="28"/>
@@ -1241,6 +1319,12 @@
             <w:vAlign w:val="center"/>
           </w:tcPr>
           <w:p>
+            <w:pPr>
+              <w:rPr>
+                <w:sz w:val="28"/>
+                <w:szCs w:val="28"/>
+              </w:rPr>
+            </w:pPr>
             <w:r>
               <w:rPr>
                 <w:sz w:val="28"/>
@@ -1262,6 +1346,12 @@
             <w:vAlign w:val="center"/>
           </w:tcPr>
           <w:p>
+            <w:pPr>
+              <w:rPr>
+                <w:sz w:val="28"/>
+                <w:szCs w:val="28"/>
+              </w:rPr>
+            </w:pPr>
             <w:r>
               <w:rPr>
                 <w:sz w:val="28"/>

</xml_diff>

<commit_message>
docs: changelog entry and refreshed Word companion preview for row and cell-text heights
</commit_message>
<xml_diff>
--- a/assets/readme/examples/word-export-companion.docx
+++ b/assets/readme/examples/word-export-companion.docx
@@ -241,6 +241,7 @@
       </w:tblGrid>
       <w:tr>
         <w:trPr>
+          <w:trHeight w:val="244" w:hRule="atLeast"/>
           <w:cantSplit w:val="on"/>
         </w:trPr>
         <w:tc>
@@ -339,6 +340,7 @@
       </w:tr>
       <w:tr>
         <w:trPr>
+          <w:trHeight w:val="244" w:hRule="atLeast"/>
           <w:cantSplit w:val="on"/>
         </w:trPr>
         <w:tc>
@@ -434,6 +436,7 @@
       </w:tr>
       <w:tr>
         <w:trPr>
+          <w:trHeight w:val="244" w:hRule="atLeast"/>
           <w:cantSplit w:val="on"/>
         </w:trPr>
         <w:tc>
@@ -529,6 +532,7 @@
       </w:tr>
       <w:tr>
         <w:trPr>
+          <w:trHeight w:val="244" w:hRule="atLeast"/>
           <w:cantSplit w:val="on"/>
         </w:trPr>
         <w:tc>
@@ -624,6 +628,7 @@
       </w:tr>
       <w:tr>
         <w:trPr>
+          <w:trHeight w:val="244" w:hRule="atLeast"/>
           <w:cantSplit w:val="on"/>
         </w:trPr>
         <w:tc>

</xml_diff>

<commit_message>
fix(docx): keep table rows and composed-cell text at the height the page gives them (#774)
* fix(docx): keep table rows and composed-cell text at the height the page gives them

* docs: changelog entry and refreshed Word companion preview for row and cell-text heights

* review-fix: pair composed paragraphs linearly and as the layout writes their text, pin the margin subtraction

* review-fix: read row and line heights through POI as numbers in the composed-cell tests
</commit_message>
<xml_diff>
--- a/assets/readme/examples/word-export-companion.docx
+++ b/assets/readme/examples/word-export-companion.docx
@@ -241,6 +241,7 @@
       </w:tblGrid>
       <w:tr>
         <w:trPr>
+          <w:trHeight w:val="244" w:hRule="atLeast"/>
           <w:cantSplit w:val="on"/>
         </w:trPr>
         <w:tc>
@@ -339,6 +340,7 @@
       </w:tr>
       <w:tr>
         <w:trPr>
+          <w:trHeight w:val="244" w:hRule="atLeast"/>
           <w:cantSplit w:val="on"/>
         </w:trPr>
         <w:tc>
@@ -434,6 +436,7 @@
       </w:tr>
       <w:tr>
         <w:trPr>
+          <w:trHeight w:val="244" w:hRule="atLeast"/>
           <w:cantSplit w:val="on"/>
         </w:trPr>
         <w:tc>
@@ -529,6 +532,7 @@
       </w:tr>
       <w:tr>
         <w:trPr>
+          <w:trHeight w:val="244" w:hRule="atLeast"/>
           <w:cantSplit w:val="on"/>
         </w:trPr>
         <w:tc>
@@ -624,6 +628,7 @@
       </w:tr>
       <w:tr>
         <w:trPr>
+          <w:trHeight w:val="244" w:hRule="atLeast"/>
           <w:cantSplit w:val="on"/>
         </w:trPr>
         <w:tc>

</xml_diff>

<commit_message>
review-fix: rank a gutter by its row's top, hold a band's line for a badge's initials, keep linked or invisible badges written
</commit_message>
<xml_diff>
--- a/assets/readme/examples/word-export-companion.docx
+++ b/assets/readme/examples/word-export-companion.docx
@@ -876,7 +876,7 @@
       </w:pPr>
       <w:r>
         <w:drawing xmlns:a="http://schemas.openxmlformats.org/drawingml/2006/main" xmlns:wps="http://schemas.microsoft.com/office/word/2010/wordprocessingShape">
-          <wp:anchor distT="0" distB="0" distL="0" distR="0" simplePos="0" relativeHeight="251659264" behindDoc="1" locked="0" layoutInCell="0" allowOverlap="1">
+          <wp:anchor distT="0" distB="0" distL="0" distR="0" simplePos="0" relativeHeight="251659264" behindDoc="0" locked="0" layoutInCell="0" allowOverlap="1">
             <wp:simplePos x="0" y="0"/>
             <wp:positionH relativeFrom="page">
               <wp:posOffset>609600</wp:posOffset>
@@ -910,7 +910,29 @@
                       </a:solidFill>
                     </a:ln>
                   </wps:spPr>
-                  <wps:bodyPr/>
+                  <wps:txbx>
+                    <w:txbxContent>
+                      <w:p>
+                        <w:pPr>
+                          <w:spacing w:before="0" w:after="0"/>
+                          <w:jc w:val="center"/>
+                        </w:pPr>
+                        <w:r>
+                          <w:rPr>
+                            <w:sz w:val="40"/>
+                            <w:szCs w:val="40"/>
+                            <w:color w:val="FFFFFF"/>
+                            <w:b w:val="on"/>
+                            <w:bCs w:val="on"/>
+                          </w:rPr>
+                          <w:t>GC</w:t>
+                        </w:r>
+                      </w:p>
+                    </w:txbxContent>
+                  </wps:txbx>
+                  <wps:bodyPr rot="0" vert="horz" wrap="none" lIns="0" tIns="0" rIns="0" bIns="0" anchor="ctr" anchorCtr="0">
+                    <a:noAutofit/>
+                  </wps:bodyPr>
                 </wps:wsp>
               </a:graphicData>
             </a:graphic>
@@ -1406,22 +1428,6 @@
         <w:spacing w:before="280" w:lineRule="exact" w:line="2"/>
         <w:ind w:left="0" w:right="1580"/>
       </w:pPr>
-    </w:p>
-    <w:p>
-      <w:pPr>
-        <w:spacing w:before="280" w:lineRule="exact" w:line="370"/>
-        <w:jc w:val="center"/>
-      </w:pPr>
-      <w:r>
-        <w:rPr>
-          <w:sz w:val="40"/>
-          <w:szCs w:val="40"/>
-          <w:color w:val="FFFFFF"/>
-          <w:b w:val="on"/>
-          <w:bCs w:val="on"/>
-        </w:rPr>
-        <w:t>GC</w:t>
-      </w:r>
     </w:p>
     <w:sectPr>
       <w:pgSz w:w="11900" w:h="16840" w:orient="portrait"/>

</xml_diff>

<commit_message>
fix(docx): write a badge as one shape holding its initials, and place drawings from the page (#777)
* fix(docx): write a badge as one shape holding its initials, and anchor a row's drawing in its own cells

* review-fix: rank a gutter by its row's top, hold a band's line for a badge's initials, keep linked or invisible badges written

* fix(docx): anchor a panel's and a row's drawing to the page, and wrap a badge's text in its box

* fix(docx): take a panel's top and bottom borders out of the space around it

* review-fix: start each cell clear of its neighbour's border, carry a row's to the block after it, pin a badge's wrap

* docs(docx): describe drawings placed from the page, badges and panel borders

* review-fix: let a badge's text reach its outline's edges, keep badges the shape cannot set in the flow, take a card's border from whatever follows

* docs(docx): state which badges become one shape, and where a card's border comes from
</commit_message>
<xml_diff>
--- a/assets/readme/examples/word-export-companion.docx
+++ b/assets/readme/examples/word-export-companion.docx
@@ -876,7 +876,7 @@
       </w:pPr>
       <w:r>
         <w:drawing xmlns:a="http://schemas.openxmlformats.org/drawingml/2006/main" xmlns:wps="http://schemas.microsoft.com/office/word/2010/wordprocessingShape">
-          <wp:anchor distT="0" distB="0" distL="0" distR="0" simplePos="0" relativeHeight="251659264" behindDoc="1" locked="0" layoutInCell="0" allowOverlap="1">
+          <wp:anchor distT="0" distB="0" distL="0" distR="0" simplePos="0" relativeHeight="251659264" behindDoc="0" locked="0" layoutInCell="0" allowOverlap="1">
             <wp:simplePos x="0" y="0"/>
             <wp:positionH relativeFrom="page">
               <wp:posOffset>609600</wp:posOffset>
@@ -910,7 +910,29 @@
                       </a:solidFill>
                     </a:ln>
                   </wps:spPr>
-                  <wps:bodyPr/>
+                  <wps:txbx>
+                    <w:txbxContent>
+                      <w:p>
+                        <w:pPr>
+                          <w:spacing w:before="0" w:after="0"/>
+                          <w:jc w:val="center"/>
+                        </w:pPr>
+                        <w:r>
+                          <w:rPr>
+                            <w:sz w:val="40"/>
+                            <w:szCs w:val="40"/>
+                            <w:color w:val="FFFFFF"/>
+                            <w:b w:val="on"/>
+                            <w:bCs w:val="on"/>
+                          </w:rPr>
+                          <w:t>GC</w:t>
+                        </w:r>
+                      </w:p>
+                    </w:txbxContent>
+                  </wps:txbx>
+                  <wps:bodyPr rot="0" vert="horz" wrap="square" lIns="-133911" tIns="-133911" rIns="-133911" bIns="-133911" anchor="ctr" anchorCtr="0">
+                    <a:noAutofit/>
+                  </wps:bodyPr>
                 </wps:wsp>
               </a:graphicData>
             </a:graphic>
@@ -1406,22 +1428,6 @@
         <w:spacing w:before="280" w:lineRule="exact" w:line="2"/>
         <w:ind w:left="0" w:right="1580"/>
       </w:pPr>
-    </w:p>
-    <w:p>
-      <w:pPr>
-        <w:spacing w:before="280" w:lineRule="exact" w:line="370"/>
-        <w:jc w:val="center"/>
-      </w:pPr>
-      <w:r>
-        <w:rPr>
-          <w:sz w:val="40"/>
-          <w:szCs w:val="40"/>
-          <w:color w:val="FFFFFF"/>
-          <w:b w:val="on"/>
-          <w:bCs w:val="on"/>
-        </w:rPr>
-        <w:t>GC</w:t>
-      </w:r>
     </w:p>
     <w:sectPr>
       <w:pgSz w:w="11900" w:h="16840" w:orient="portrait"/>

</xml_diff>

<commit_message>
fix(docx): give a table's rules out of its cells' padding where Word makes room for them
Word makes room in a table for its horizontal rules: a rule between two rows half in each, the rules above and below the table whole in their row. The page does not, so every ruled table grew row by row. A table that states no rule is written with the engine's default 1pt rule, as the page draws it.
</commit_message>
<xml_diff>
--- a/assets/readme/examples/word-export-companion.docx
+++ b/assets/readme/examples/word-export-companion.docx
@@ -241,7 +241,7 @@
       </w:tblGrid>
       <w:tr>
         <w:trPr>
-          <w:trHeight w:val="244" w:hRule="atLeast"/>
+          <w:trHeight w:val="266" w:hRule="atLeast"/>
           <w:cantSplit w:val="on"/>
         </w:trPr>
         <w:tc>
@@ -254,9 +254,9 @@
             </w:tcBorders>
             <w:shd w:val="clear" w:fill="E8EEF3"/>
             <w:tcMar>
-              <w:top w:type="dxa" w:w="80"/>
-              <w:left w:type="dxa" w:w="80"/>
-              <w:bottom w:type="dxa" w:w="80"/>
+              <w:top w:type="dxa" w:w="65"/>
+              <w:left w:type="dxa" w:w="80"/>
+              <w:bottom w:type="dxa" w:w="73"/>
               <w:right w:type="dxa" w:w="80"/>
             </w:tcMar>
             <w:vAlign w:val="center"/>
@@ -285,9 +285,9 @@
             </w:tcBorders>
             <w:shd w:val="clear" w:fill="E8EEF3"/>
             <w:tcMar>
-              <w:top w:type="dxa" w:w="80"/>
-              <w:left w:type="dxa" w:w="80"/>
-              <w:bottom w:type="dxa" w:w="80"/>
+              <w:top w:type="dxa" w:w="65"/>
+              <w:left w:type="dxa" w:w="80"/>
+              <w:bottom w:type="dxa" w:w="73"/>
               <w:right w:type="dxa" w:w="80"/>
             </w:tcMar>
             <w:vAlign w:val="center"/>
@@ -316,9 +316,9 @@
             </w:tcBorders>
             <w:shd w:val="clear" w:fill="E8EEF3"/>
             <w:tcMar>
-              <w:top w:type="dxa" w:w="80"/>
-              <w:left w:type="dxa" w:w="80"/>
-              <w:bottom w:type="dxa" w:w="80"/>
+              <w:top w:type="dxa" w:w="65"/>
+              <w:left w:type="dxa" w:w="80"/>
+              <w:bottom w:type="dxa" w:w="73"/>
               <w:right w:type="dxa" w:w="80"/>
             </w:tcMar>
             <w:vAlign w:val="center"/>
@@ -340,7 +340,7 @@
       </w:tr>
       <w:tr>
         <w:trPr>
-          <w:trHeight w:val="244" w:hRule="atLeast"/>
+          <w:trHeight w:val="258" w:hRule="atLeast"/>
           <w:cantSplit w:val="on"/>
         </w:trPr>
         <w:tc>
@@ -352,9 +352,9 @@
               <w:right w:val="single" w:sz="6" w:color="CDD4DB"/>
             </w:tcBorders>
             <w:tcMar>
-              <w:top w:type="dxa" w:w="80"/>
-              <w:left w:type="dxa" w:w="80"/>
-              <w:bottom w:type="dxa" w:w="80"/>
+              <w:top w:type="dxa" w:w="73"/>
+              <w:left w:type="dxa" w:w="80"/>
+              <w:bottom w:type="dxa" w:w="73"/>
               <w:right w:type="dxa" w:w="80"/>
             </w:tcMar>
             <w:vAlign w:val="center"/>
@@ -382,9 +382,9 @@
               <w:right w:val="single" w:sz="6" w:color="CDD4DB"/>
             </w:tcBorders>
             <w:tcMar>
-              <w:top w:type="dxa" w:w="80"/>
-              <w:left w:type="dxa" w:w="80"/>
-              <w:bottom w:type="dxa" w:w="80"/>
+              <w:top w:type="dxa" w:w="73"/>
+              <w:left w:type="dxa" w:w="80"/>
+              <w:bottom w:type="dxa" w:w="73"/>
               <w:right w:type="dxa" w:w="80"/>
             </w:tcMar>
             <w:vAlign w:val="center"/>
@@ -412,9 +412,9 @@
               <w:right w:val="single" w:sz="6" w:color="CDD4DB"/>
             </w:tcBorders>
             <w:tcMar>
-              <w:top w:type="dxa" w:w="80"/>
-              <w:left w:type="dxa" w:w="80"/>
-              <w:bottom w:type="dxa" w:w="80"/>
+              <w:top w:type="dxa" w:w="73"/>
+              <w:left w:type="dxa" w:w="80"/>
+              <w:bottom w:type="dxa" w:w="73"/>
               <w:right w:type="dxa" w:w="80"/>
             </w:tcMar>
             <w:vAlign w:val="center"/>
@@ -436,7 +436,7 @@
       </w:tr>
       <w:tr>
         <w:trPr>
-          <w:trHeight w:val="244" w:hRule="atLeast"/>
+          <w:trHeight w:val="258" w:hRule="atLeast"/>
           <w:cantSplit w:val="on"/>
         </w:trPr>
         <w:tc>
@@ -448,9 +448,9 @@
               <w:right w:val="single" w:sz="6" w:color="CDD4DB"/>
             </w:tcBorders>
             <w:tcMar>
-              <w:top w:type="dxa" w:w="80"/>
-              <w:left w:type="dxa" w:w="80"/>
-              <w:bottom w:type="dxa" w:w="80"/>
+              <w:top w:type="dxa" w:w="73"/>
+              <w:left w:type="dxa" w:w="80"/>
+              <w:bottom w:type="dxa" w:w="73"/>
               <w:right w:type="dxa" w:w="80"/>
             </w:tcMar>
             <w:vAlign w:val="center"/>
@@ -478,9 +478,9 @@
               <w:right w:val="single" w:sz="6" w:color="CDD4DB"/>
             </w:tcBorders>
             <w:tcMar>
-              <w:top w:type="dxa" w:w="80"/>
-              <w:left w:type="dxa" w:w="80"/>
-              <w:bottom w:type="dxa" w:w="80"/>
+              <w:top w:type="dxa" w:w="73"/>
+              <w:left w:type="dxa" w:w="80"/>
+              <w:bottom w:type="dxa" w:w="73"/>
               <w:right w:type="dxa" w:w="80"/>
             </w:tcMar>
             <w:vAlign w:val="center"/>
@@ -508,9 +508,9 @@
               <w:right w:val="single" w:sz="6" w:color="CDD4DB"/>
             </w:tcBorders>
             <w:tcMar>
-              <w:top w:type="dxa" w:w="80"/>
-              <w:left w:type="dxa" w:w="80"/>
-              <w:bottom w:type="dxa" w:w="80"/>
+              <w:top w:type="dxa" w:w="73"/>
+              <w:left w:type="dxa" w:w="80"/>
+              <w:bottom w:type="dxa" w:w="73"/>
               <w:right w:type="dxa" w:w="80"/>
             </w:tcMar>
             <w:vAlign w:val="center"/>
@@ -532,7 +532,7 @@
       </w:tr>
       <w:tr>
         <w:trPr>
-          <w:trHeight w:val="244" w:hRule="atLeast"/>
+          <w:trHeight w:val="258" w:hRule="atLeast"/>
           <w:cantSplit w:val="on"/>
         </w:trPr>
         <w:tc>
@@ -544,9 +544,9 @@
               <w:right w:val="single" w:sz="6" w:color="CDD4DB"/>
             </w:tcBorders>
             <w:tcMar>
-              <w:top w:type="dxa" w:w="80"/>
-              <w:left w:type="dxa" w:w="80"/>
-              <w:bottom w:type="dxa" w:w="80"/>
+              <w:top w:type="dxa" w:w="73"/>
+              <w:left w:type="dxa" w:w="80"/>
+              <w:bottom w:type="dxa" w:w="73"/>
               <w:right w:type="dxa" w:w="80"/>
             </w:tcMar>
             <w:vAlign w:val="center"/>
@@ -574,9 +574,9 @@
               <w:right w:val="single" w:sz="6" w:color="CDD4DB"/>
             </w:tcBorders>
             <w:tcMar>
-              <w:top w:type="dxa" w:w="80"/>
-              <w:left w:type="dxa" w:w="80"/>
-              <w:bottom w:type="dxa" w:w="80"/>
+              <w:top w:type="dxa" w:w="73"/>
+              <w:left w:type="dxa" w:w="80"/>
+              <w:bottom w:type="dxa" w:w="73"/>
               <w:right w:type="dxa" w:w="80"/>
             </w:tcMar>
             <w:vAlign w:val="center"/>
@@ -604,9 +604,9 @@
               <w:right w:val="single" w:sz="6" w:color="CDD4DB"/>
             </w:tcBorders>
             <w:tcMar>
-              <w:top w:type="dxa" w:w="80"/>
-              <w:left w:type="dxa" w:w="80"/>
-              <w:bottom w:type="dxa" w:w="80"/>
+              <w:top w:type="dxa" w:w="73"/>
+              <w:left w:type="dxa" w:w="80"/>
+              <w:bottom w:type="dxa" w:w="73"/>
               <w:right w:type="dxa" w:w="80"/>
             </w:tcMar>
             <w:vAlign w:val="center"/>
@@ -628,7 +628,7 @@
       </w:tr>
       <w:tr>
         <w:trPr>
-          <w:trHeight w:val="244" w:hRule="atLeast"/>
+          <w:trHeight w:val="266" w:hRule="atLeast"/>
           <w:cantSplit w:val="on"/>
         </w:trPr>
         <w:tc>
@@ -640,9 +640,9 @@
               <w:right w:val="single" w:sz="6" w:color="CDD4DB"/>
             </w:tcBorders>
             <w:tcMar>
-              <w:top w:type="dxa" w:w="80"/>
-              <w:left w:type="dxa" w:w="80"/>
-              <w:bottom w:type="dxa" w:w="80"/>
+              <w:top w:type="dxa" w:w="73"/>
+              <w:left w:type="dxa" w:w="80"/>
+              <w:bottom w:type="dxa" w:w="65"/>
               <w:right w:type="dxa" w:w="80"/>
             </w:tcMar>
             <w:vAlign w:val="center"/>
@@ -670,9 +670,9 @@
               <w:right w:val="single" w:sz="6" w:color="CDD4DB"/>
             </w:tcBorders>
             <w:tcMar>
-              <w:top w:type="dxa" w:w="80"/>
-              <w:left w:type="dxa" w:w="80"/>
-              <w:bottom w:type="dxa" w:w="80"/>
+              <w:top w:type="dxa" w:w="73"/>
+              <w:left w:type="dxa" w:w="80"/>
+              <w:bottom w:type="dxa" w:w="65"/>
               <w:right w:type="dxa" w:w="80"/>
             </w:tcMar>
             <w:vAlign w:val="center"/>
@@ -700,9 +700,9 @@
               <w:right w:val="single" w:sz="6" w:color="CDD4DB"/>
             </w:tcBorders>
             <w:tcMar>
-              <w:top w:type="dxa" w:w="80"/>
-              <w:left w:type="dxa" w:w="80"/>
-              <w:bottom w:type="dxa" w:w="80"/>
+              <w:top w:type="dxa" w:w="73"/>
+              <w:left w:type="dxa" w:w="80"/>
+              <w:bottom w:type="dxa" w:w="65"/>
               <w:right w:type="dxa" w:w="80"/>
             </w:tcMar>
             <w:vAlign w:val="center"/>
@@ -978,10 +978,16 @@
       <w:tr>
         <w:tc>
           <w:tcPr>
-            <w:tcMar>
-              <w:top w:type="dxa" w:w="80"/>
-              <w:left w:type="dxa" w:w="80"/>
-              <w:bottom w:type="dxa" w:w="80"/>
+            <w:tcBorders>
+              <w:top w:val="single" w:sz="8" w:color="000000"/>
+              <w:left w:val="single" w:sz="8" w:color="000000"/>
+              <w:bottom w:val="single" w:sz="8" w:color="000000"/>
+              <w:right w:val="single" w:sz="8" w:color="000000"/>
+            </w:tcBorders>
+            <w:tcMar>
+              <w:top w:type="dxa" w:w="60"/>
+              <w:left w:type="dxa" w:w="80"/>
+              <w:bottom w:type="dxa" w:w="70"/>
               <w:right w:type="dxa" w:w="80"/>
             </w:tcMar>
             <w:vAlign w:val="center"/>
@@ -1005,10 +1011,16 @@
         </w:tc>
         <w:tc>
           <w:tcPr>
-            <w:tcMar>
-              <w:top w:type="dxa" w:w="80"/>
-              <w:left w:type="dxa" w:w="80"/>
-              <w:bottom w:type="dxa" w:w="80"/>
+            <w:tcBorders>
+              <w:top w:val="single" w:sz="8" w:color="000000"/>
+              <w:left w:val="single" w:sz="8" w:color="000000"/>
+              <w:bottom w:val="single" w:sz="8" w:color="000000"/>
+              <w:right w:val="single" w:sz="8" w:color="000000"/>
+            </w:tcBorders>
+            <w:tcMar>
+              <w:top w:type="dxa" w:w="60"/>
+              <w:left w:type="dxa" w:w="80"/>
+              <w:bottom w:type="dxa" w:w="70"/>
               <w:right w:type="dxa" w:w="80"/>
             </w:tcMar>
             <w:vAlign w:val="center"/>
@@ -1032,10 +1044,16 @@
         </w:tc>
         <w:tc>
           <w:tcPr>
-            <w:tcMar>
-              <w:top w:type="dxa" w:w="80"/>
-              <w:left w:type="dxa" w:w="80"/>
-              <w:bottom w:type="dxa" w:w="80"/>
+            <w:tcBorders>
+              <w:top w:val="single" w:sz="8" w:color="000000"/>
+              <w:left w:val="single" w:sz="8" w:color="000000"/>
+              <w:bottom w:val="single" w:sz="8" w:color="000000"/>
+              <w:right w:val="single" w:sz="8" w:color="000000"/>
+            </w:tcBorders>
+            <w:tcMar>
+              <w:top w:type="dxa" w:w="60"/>
+              <w:left w:type="dxa" w:w="80"/>
+              <w:bottom w:type="dxa" w:w="70"/>
               <w:right w:type="dxa" w:w="80"/>
             </w:tcMar>
             <w:vAlign w:val="center"/>
@@ -1061,10 +1079,16 @@
       <w:tr>
         <w:tc>
           <w:tcPr>
-            <w:tcMar>
-              <w:top w:type="dxa" w:w="80"/>
-              <w:left w:type="dxa" w:w="80"/>
-              <w:bottom w:type="dxa" w:w="80"/>
+            <w:tcBorders>
+              <w:top w:val="single" w:sz="8" w:color="000000"/>
+              <w:left w:val="single" w:sz="8" w:color="000000"/>
+              <w:bottom w:val="single" w:sz="8" w:color="000000"/>
+              <w:right w:val="single" w:sz="8" w:color="000000"/>
+            </w:tcBorders>
+            <w:tcMar>
+              <w:top w:type="dxa" w:w="70"/>
+              <w:left w:type="dxa" w:w="80"/>
+              <w:bottom w:type="dxa" w:w="70"/>
               <w:right w:type="dxa" w:w="80"/>
             </w:tcMar>
             <w:vAlign w:val="center"/>
@@ -1088,10 +1112,16 @@
         </w:tc>
         <w:tc>
           <w:tcPr>
-            <w:tcMar>
-              <w:top w:type="dxa" w:w="80"/>
-              <w:left w:type="dxa" w:w="80"/>
-              <w:bottom w:type="dxa" w:w="80"/>
+            <w:tcBorders>
+              <w:top w:val="single" w:sz="8" w:color="000000"/>
+              <w:left w:val="single" w:sz="8" w:color="000000"/>
+              <w:bottom w:val="single" w:sz="8" w:color="000000"/>
+              <w:right w:val="single" w:sz="8" w:color="000000"/>
+            </w:tcBorders>
+            <w:tcMar>
+              <w:top w:type="dxa" w:w="70"/>
+              <w:left w:type="dxa" w:w="80"/>
+              <w:bottom w:type="dxa" w:w="70"/>
               <w:right w:type="dxa" w:w="80"/>
             </w:tcMar>
             <w:vAlign w:val="center"/>
@@ -1115,10 +1145,16 @@
         </w:tc>
         <w:tc>
           <w:tcPr>
-            <w:tcMar>
-              <w:top w:type="dxa" w:w="80"/>
-              <w:left w:type="dxa" w:w="80"/>
-              <w:bottom w:type="dxa" w:w="80"/>
+            <w:tcBorders>
+              <w:top w:val="single" w:sz="8" w:color="000000"/>
+              <w:left w:val="single" w:sz="8" w:color="000000"/>
+              <w:bottom w:val="single" w:sz="8" w:color="000000"/>
+              <w:right w:val="single" w:sz="8" w:color="000000"/>
+            </w:tcBorders>
+            <w:tcMar>
+              <w:top w:type="dxa" w:w="70"/>
+              <w:left w:type="dxa" w:w="80"/>
+              <w:bottom w:type="dxa" w:w="70"/>
               <w:right w:type="dxa" w:w="80"/>
             </w:tcMar>
             <w:vAlign w:val="center"/>
@@ -1144,10 +1180,16 @@
       <w:tr>
         <w:tc>
           <w:tcPr>
-            <w:tcMar>
-              <w:top w:type="dxa" w:w="80"/>
-              <w:left w:type="dxa" w:w="80"/>
-              <w:bottom w:type="dxa" w:w="80"/>
+            <w:tcBorders>
+              <w:top w:val="single" w:sz="8" w:color="000000"/>
+              <w:left w:val="single" w:sz="8" w:color="000000"/>
+              <w:bottom w:val="single" w:sz="8" w:color="000000"/>
+              <w:right w:val="single" w:sz="8" w:color="000000"/>
+            </w:tcBorders>
+            <w:tcMar>
+              <w:top w:type="dxa" w:w="70"/>
+              <w:left w:type="dxa" w:w="80"/>
+              <w:bottom w:type="dxa" w:w="70"/>
               <w:right w:type="dxa" w:w="80"/>
             </w:tcMar>
             <w:vAlign w:val="center"/>
@@ -1171,10 +1213,16 @@
         </w:tc>
         <w:tc>
           <w:tcPr>
-            <w:tcMar>
-              <w:top w:type="dxa" w:w="80"/>
-              <w:left w:type="dxa" w:w="80"/>
-              <w:bottom w:type="dxa" w:w="80"/>
+            <w:tcBorders>
+              <w:top w:val="single" w:sz="8" w:color="000000"/>
+              <w:left w:val="single" w:sz="8" w:color="000000"/>
+              <w:bottom w:val="single" w:sz="8" w:color="000000"/>
+              <w:right w:val="single" w:sz="8" w:color="000000"/>
+            </w:tcBorders>
+            <w:tcMar>
+              <w:top w:type="dxa" w:w="70"/>
+              <w:left w:type="dxa" w:w="80"/>
+              <w:bottom w:type="dxa" w:w="70"/>
               <w:right w:type="dxa" w:w="80"/>
             </w:tcMar>
             <w:vAlign w:val="center"/>
@@ -1198,10 +1246,16 @@
         </w:tc>
         <w:tc>
           <w:tcPr>
-            <w:tcMar>
-              <w:top w:type="dxa" w:w="80"/>
-              <w:left w:type="dxa" w:w="80"/>
-              <w:bottom w:type="dxa" w:w="80"/>
+            <w:tcBorders>
+              <w:top w:val="single" w:sz="8" w:color="000000"/>
+              <w:left w:val="single" w:sz="8" w:color="000000"/>
+              <w:bottom w:val="single" w:sz="8" w:color="000000"/>
+              <w:right w:val="single" w:sz="8" w:color="000000"/>
+            </w:tcBorders>
+            <w:tcMar>
+              <w:top w:type="dxa" w:w="70"/>
+              <w:left w:type="dxa" w:w="80"/>
+              <w:bottom w:type="dxa" w:w="70"/>
               <w:right w:type="dxa" w:w="80"/>
             </w:tcMar>
             <w:vAlign w:val="center"/>
@@ -1227,10 +1281,16 @@
       <w:tr>
         <w:tc>
           <w:tcPr>
-            <w:tcMar>
-              <w:top w:type="dxa" w:w="80"/>
-              <w:left w:type="dxa" w:w="80"/>
-              <w:bottom w:type="dxa" w:w="80"/>
+            <w:tcBorders>
+              <w:top w:val="single" w:sz="8" w:color="000000"/>
+              <w:left w:val="single" w:sz="8" w:color="000000"/>
+              <w:bottom w:val="single" w:sz="8" w:color="000000"/>
+              <w:right w:val="single" w:sz="8" w:color="000000"/>
+            </w:tcBorders>
+            <w:tcMar>
+              <w:top w:type="dxa" w:w="70"/>
+              <w:left w:type="dxa" w:w="80"/>
+              <w:bottom w:type="dxa" w:w="70"/>
               <w:right w:type="dxa" w:w="80"/>
             </w:tcMar>
             <w:vAlign w:val="center"/>
@@ -1254,10 +1314,16 @@
         </w:tc>
         <w:tc>
           <w:tcPr>
-            <w:tcMar>
-              <w:top w:type="dxa" w:w="80"/>
-              <w:left w:type="dxa" w:w="80"/>
-              <w:bottom w:type="dxa" w:w="80"/>
+            <w:tcBorders>
+              <w:top w:val="single" w:sz="8" w:color="000000"/>
+              <w:left w:val="single" w:sz="8" w:color="000000"/>
+              <w:bottom w:val="single" w:sz="8" w:color="000000"/>
+              <w:right w:val="single" w:sz="8" w:color="000000"/>
+            </w:tcBorders>
+            <w:tcMar>
+              <w:top w:type="dxa" w:w="70"/>
+              <w:left w:type="dxa" w:w="80"/>
+              <w:bottom w:type="dxa" w:w="70"/>
               <w:right w:type="dxa" w:w="80"/>
             </w:tcMar>
             <w:vAlign w:val="center"/>
@@ -1281,10 +1347,16 @@
         </w:tc>
         <w:tc>
           <w:tcPr>
-            <w:tcMar>
-              <w:top w:type="dxa" w:w="80"/>
-              <w:left w:type="dxa" w:w="80"/>
-              <w:bottom w:type="dxa" w:w="80"/>
+            <w:tcBorders>
+              <w:top w:val="single" w:sz="8" w:color="000000"/>
+              <w:left w:val="single" w:sz="8" w:color="000000"/>
+              <w:bottom w:val="single" w:sz="8" w:color="000000"/>
+              <w:right w:val="single" w:sz="8" w:color="000000"/>
+            </w:tcBorders>
+            <w:tcMar>
+              <w:top w:type="dxa" w:w="70"/>
+              <w:left w:type="dxa" w:w="80"/>
+              <w:bottom w:type="dxa" w:w="70"/>
               <w:right w:type="dxa" w:w="80"/>
             </w:tcMar>
             <w:vAlign w:val="center"/>
@@ -1310,10 +1382,16 @@
       <w:tr>
         <w:tc>
           <w:tcPr>
-            <w:tcMar>
-              <w:top w:type="dxa" w:w="80"/>
-              <w:left w:type="dxa" w:w="80"/>
-              <w:bottom w:type="dxa" w:w="80"/>
+            <w:tcBorders>
+              <w:top w:val="single" w:sz="8" w:color="000000"/>
+              <w:left w:val="single" w:sz="8" w:color="000000"/>
+              <w:bottom w:val="single" w:sz="8" w:color="000000"/>
+              <w:right w:val="single" w:sz="8" w:color="000000"/>
+            </w:tcBorders>
+            <w:tcMar>
+              <w:top w:type="dxa" w:w="70"/>
+              <w:left w:type="dxa" w:w="80"/>
+              <w:bottom w:type="dxa" w:w="60"/>
               <w:right w:type="dxa" w:w="80"/>
             </w:tcMar>
             <w:vAlign w:val="center"/>
@@ -1337,10 +1415,16 @@
         </w:tc>
         <w:tc>
           <w:tcPr>
-            <w:tcMar>
-              <w:top w:type="dxa" w:w="80"/>
-              <w:left w:type="dxa" w:w="80"/>
-              <w:bottom w:type="dxa" w:w="80"/>
+            <w:tcBorders>
+              <w:top w:val="single" w:sz="8" w:color="000000"/>
+              <w:left w:val="single" w:sz="8" w:color="000000"/>
+              <w:bottom w:val="single" w:sz="8" w:color="000000"/>
+              <w:right w:val="single" w:sz="8" w:color="000000"/>
+            </w:tcBorders>
+            <w:tcMar>
+              <w:top w:type="dxa" w:w="70"/>
+              <w:left w:type="dxa" w:w="80"/>
+              <w:bottom w:type="dxa" w:w="60"/>
               <w:right w:type="dxa" w:w="80"/>
             </w:tcMar>
             <w:vAlign w:val="center"/>
@@ -1364,10 +1448,16 @@
         </w:tc>
         <w:tc>
           <w:tcPr>
-            <w:tcMar>
-              <w:top w:type="dxa" w:w="80"/>
-              <w:left w:type="dxa" w:w="80"/>
-              <w:bottom w:type="dxa" w:w="80"/>
+            <w:tcBorders>
+              <w:top w:val="single" w:sz="8" w:color="000000"/>
+              <w:left w:val="single" w:sz="8" w:color="000000"/>
+              <w:bottom w:val="single" w:sz="8" w:color="000000"/>
+              <w:right w:val="single" w:sz="8" w:color="000000"/>
+            </w:tcBorders>
+            <w:tcMar>
+              <w:top w:type="dxa" w:w="70"/>
+              <w:left w:type="dxa" w:w="80"/>
+              <w:bottom w:type="dxa" w:w="60"/>
               <w:right w:type="dxa" w:w="80"/>
             </w:tcMar>
             <w:vAlign w:val="center"/>

</xml_diff>

<commit_message>
fix(docx): give a table's rules out of its cells' padding where Word makes room for them (#790)
* fix(docx): give a table's rules out of its cells' padding where Word makes room for them

Word makes room in a table for its horizontal rules: a rule between two rows half in each, the rules above and below the table whole in their row. The page does not, so every ruled table grew row by row. A table that states no rule is written with the engine's default 1pt rule, as the page draws it.

* fix(docx): give up the lower row's rule at an edge between rows ruled differently

Measured, Word makes room at a shared edge for the lower row's rule: a 1.5pt header over 0.5pt rows steps as 0.5pt rules do. A cell's padding below now gives up half the rule of the row under it.
</commit_message>
<xml_diff>
--- a/assets/readme/examples/word-export-companion.docx
+++ b/assets/readme/examples/word-export-companion.docx
@@ -241,7 +241,7 @@
       </w:tblGrid>
       <w:tr>
         <w:trPr>
-          <w:trHeight w:val="244" w:hRule="atLeast"/>
+          <w:trHeight w:val="266" w:hRule="atLeast"/>
           <w:cantSplit w:val="on"/>
         </w:trPr>
         <w:tc>
@@ -254,9 +254,9 @@
             </w:tcBorders>
             <w:shd w:val="clear" w:fill="E8EEF3"/>
             <w:tcMar>
-              <w:top w:type="dxa" w:w="80"/>
-              <w:left w:type="dxa" w:w="80"/>
-              <w:bottom w:type="dxa" w:w="80"/>
+              <w:top w:type="dxa" w:w="65"/>
+              <w:left w:type="dxa" w:w="80"/>
+              <w:bottom w:type="dxa" w:w="73"/>
               <w:right w:type="dxa" w:w="80"/>
             </w:tcMar>
             <w:vAlign w:val="center"/>
@@ -285,9 +285,9 @@
             </w:tcBorders>
             <w:shd w:val="clear" w:fill="E8EEF3"/>
             <w:tcMar>
-              <w:top w:type="dxa" w:w="80"/>
-              <w:left w:type="dxa" w:w="80"/>
-              <w:bottom w:type="dxa" w:w="80"/>
+              <w:top w:type="dxa" w:w="65"/>
+              <w:left w:type="dxa" w:w="80"/>
+              <w:bottom w:type="dxa" w:w="73"/>
               <w:right w:type="dxa" w:w="80"/>
             </w:tcMar>
             <w:vAlign w:val="center"/>
@@ -316,9 +316,9 @@
             </w:tcBorders>
             <w:shd w:val="clear" w:fill="E8EEF3"/>
             <w:tcMar>
-              <w:top w:type="dxa" w:w="80"/>
-              <w:left w:type="dxa" w:w="80"/>
-              <w:bottom w:type="dxa" w:w="80"/>
+              <w:top w:type="dxa" w:w="65"/>
+              <w:left w:type="dxa" w:w="80"/>
+              <w:bottom w:type="dxa" w:w="73"/>
               <w:right w:type="dxa" w:w="80"/>
             </w:tcMar>
             <w:vAlign w:val="center"/>
@@ -340,7 +340,7 @@
       </w:tr>
       <w:tr>
         <w:trPr>
-          <w:trHeight w:val="244" w:hRule="atLeast"/>
+          <w:trHeight w:val="258" w:hRule="atLeast"/>
           <w:cantSplit w:val="on"/>
         </w:trPr>
         <w:tc>
@@ -352,9 +352,9 @@
               <w:right w:val="single" w:sz="6" w:color="CDD4DB"/>
             </w:tcBorders>
             <w:tcMar>
-              <w:top w:type="dxa" w:w="80"/>
-              <w:left w:type="dxa" w:w="80"/>
-              <w:bottom w:type="dxa" w:w="80"/>
+              <w:top w:type="dxa" w:w="73"/>
+              <w:left w:type="dxa" w:w="80"/>
+              <w:bottom w:type="dxa" w:w="73"/>
               <w:right w:type="dxa" w:w="80"/>
             </w:tcMar>
             <w:vAlign w:val="center"/>
@@ -382,9 +382,9 @@
               <w:right w:val="single" w:sz="6" w:color="CDD4DB"/>
             </w:tcBorders>
             <w:tcMar>
-              <w:top w:type="dxa" w:w="80"/>
-              <w:left w:type="dxa" w:w="80"/>
-              <w:bottom w:type="dxa" w:w="80"/>
+              <w:top w:type="dxa" w:w="73"/>
+              <w:left w:type="dxa" w:w="80"/>
+              <w:bottom w:type="dxa" w:w="73"/>
               <w:right w:type="dxa" w:w="80"/>
             </w:tcMar>
             <w:vAlign w:val="center"/>
@@ -412,9 +412,9 @@
               <w:right w:val="single" w:sz="6" w:color="CDD4DB"/>
             </w:tcBorders>
             <w:tcMar>
-              <w:top w:type="dxa" w:w="80"/>
-              <w:left w:type="dxa" w:w="80"/>
-              <w:bottom w:type="dxa" w:w="80"/>
+              <w:top w:type="dxa" w:w="73"/>
+              <w:left w:type="dxa" w:w="80"/>
+              <w:bottom w:type="dxa" w:w="73"/>
               <w:right w:type="dxa" w:w="80"/>
             </w:tcMar>
             <w:vAlign w:val="center"/>
@@ -436,7 +436,7 @@
       </w:tr>
       <w:tr>
         <w:trPr>
-          <w:trHeight w:val="244" w:hRule="atLeast"/>
+          <w:trHeight w:val="258" w:hRule="atLeast"/>
           <w:cantSplit w:val="on"/>
         </w:trPr>
         <w:tc>
@@ -448,9 +448,9 @@
               <w:right w:val="single" w:sz="6" w:color="CDD4DB"/>
             </w:tcBorders>
             <w:tcMar>
-              <w:top w:type="dxa" w:w="80"/>
-              <w:left w:type="dxa" w:w="80"/>
-              <w:bottom w:type="dxa" w:w="80"/>
+              <w:top w:type="dxa" w:w="73"/>
+              <w:left w:type="dxa" w:w="80"/>
+              <w:bottom w:type="dxa" w:w="73"/>
               <w:right w:type="dxa" w:w="80"/>
             </w:tcMar>
             <w:vAlign w:val="center"/>
@@ -478,9 +478,9 @@
               <w:right w:val="single" w:sz="6" w:color="CDD4DB"/>
             </w:tcBorders>
             <w:tcMar>
-              <w:top w:type="dxa" w:w="80"/>
-              <w:left w:type="dxa" w:w="80"/>
-              <w:bottom w:type="dxa" w:w="80"/>
+              <w:top w:type="dxa" w:w="73"/>
+              <w:left w:type="dxa" w:w="80"/>
+              <w:bottom w:type="dxa" w:w="73"/>
               <w:right w:type="dxa" w:w="80"/>
             </w:tcMar>
             <w:vAlign w:val="center"/>
@@ -508,9 +508,9 @@
               <w:right w:val="single" w:sz="6" w:color="CDD4DB"/>
             </w:tcBorders>
             <w:tcMar>
-              <w:top w:type="dxa" w:w="80"/>
-              <w:left w:type="dxa" w:w="80"/>
-              <w:bottom w:type="dxa" w:w="80"/>
+              <w:top w:type="dxa" w:w="73"/>
+              <w:left w:type="dxa" w:w="80"/>
+              <w:bottom w:type="dxa" w:w="73"/>
               <w:right w:type="dxa" w:w="80"/>
             </w:tcMar>
             <w:vAlign w:val="center"/>
@@ -532,7 +532,7 @@
       </w:tr>
       <w:tr>
         <w:trPr>
-          <w:trHeight w:val="244" w:hRule="atLeast"/>
+          <w:trHeight w:val="258" w:hRule="atLeast"/>
           <w:cantSplit w:val="on"/>
         </w:trPr>
         <w:tc>
@@ -544,9 +544,9 @@
               <w:right w:val="single" w:sz="6" w:color="CDD4DB"/>
             </w:tcBorders>
             <w:tcMar>
-              <w:top w:type="dxa" w:w="80"/>
-              <w:left w:type="dxa" w:w="80"/>
-              <w:bottom w:type="dxa" w:w="80"/>
+              <w:top w:type="dxa" w:w="73"/>
+              <w:left w:type="dxa" w:w="80"/>
+              <w:bottom w:type="dxa" w:w="73"/>
               <w:right w:type="dxa" w:w="80"/>
             </w:tcMar>
             <w:vAlign w:val="center"/>
@@ -574,9 +574,9 @@
               <w:right w:val="single" w:sz="6" w:color="CDD4DB"/>
             </w:tcBorders>
             <w:tcMar>
-              <w:top w:type="dxa" w:w="80"/>
-              <w:left w:type="dxa" w:w="80"/>
-              <w:bottom w:type="dxa" w:w="80"/>
+              <w:top w:type="dxa" w:w="73"/>
+              <w:left w:type="dxa" w:w="80"/>
+              <w:bottom w:type="dxa" w:w="73"/>
               <w:right w:type="dxa" w:w="80"/>
             </w:tcMar>
             <w:vAlign w:val="center"/>
@@ -604,9 +604,9 @@
               <w:right w:val="single" w:sz="6" w:color="CDD4DB"/>
             </w:tcBorders>
             <w:tcMar>
-              <w:top w:type="dxa" w:w="80"/>
-              <w:left w:type="dxa" w:w="80"/>
-              <w:bottom w:type="dxa" w:w="80"/>
+              <w:top w:type="dxa" w:w="73"/>
+              <w:left w:type="dxa" w:w="80"/>
+              <w:bottom w:type="dxa" w:w="73"/>
               <w:right w:type="dxa" w:w="80"/>
             </w:tcMar>
             <w:vAlign w:val="center"/>
@@ -628,7 +628,7 @@
       </w:tr>
       <w:tr>
         <w:trPr>
-          <w:trHeight w:val="244" w:hRule="atLeast"/>
+          <w:trHeight w:val="266" w:hRule="atLeast"/>
           <w:cantSplit w:val="on"/>
         </w:trPr>
         <w:tc>
@@ -640,9 +640,9 @@
               <w:right w:val="single" w:sz="6" w:color="CDD4DB"/>
             </w:tcBorders>
             <w:tcMar>
-              <w:top w:type="dxa" w:w="80"/>
-              <w:left w:type="dxa" w:w="80"/>
-              <w:bottom w:type="dxa" w:w="80"/>
+              <w:top w:type="dxa" w:w="73"/>
+              <w:left w:type="dxa" w:w="80"/>
+              <w:bottom w:type="dxa" w:w="65"/>
               <w:right w:type="dxa" w:w="80"/>
             </w:tcMar>
             <w:vAlign w:val="center"/>
@@ -670,9 +670,9 @@
               <w:right w:val="single" w:sz="6" w:color="CDD4DB"/>
             </w:tcBorders>
             <w:tcMar>
-              <w:top w:type="dxa" w:w="80"/>
-              <w:left w:type="dxa" w:w="80"/>
-              <w:bottom w:type="dxa" w:w="80"/>
+              <w:top w:type="dxa" w:w="73"/>
+              <w:left w:type="dxa" w:w="80"/>
+              <w:bottom w:type="dxa" w:w="65"/>
               <w:right w:type="dxa" w:w="80"/>
             </w:tcMar>
             <w:vAlign w:val="center"/>
@@ -700,9 +700,9 @@
               <w:right w:val="single" w:sz="6" w:color="CDD4DB"/>
             </w:tcBorders>
             <w:tcMar>
-              <w:top w:type="dxa" w:w="80"/>
-              <w:left w:type="dxa" w:w="80"/>
-              <w:bottom w:type="dxa" w:w="80"/>
+              <w:top w:type="dxa" w:w="73"/>
+              <w:left w:type="dxa" w:w="80"/>
+              <w:bottom w:type="dxa" w:w="65"/>
               <w:right w:type="dxa" w:w="80"/>
             </w:tcMar>
             <w:vAlign w:val="center"/>
@@ -978,10 +978,16 @@
       <w:tr>
         <w:tc>
           <w:tcPr>
-            <w:tcMar>
-              <w:top w:type="dxa" w:w="80"/>
-              <w:left w:type="dxa" w:w="80"/>
-              <w:bottom w:type="dxa" w:w="80"/>
+            <w:tcBorders>
+              <w:top w:val="single" w:sz="8" w:color="000000"/>
+              <w:left w:val="single" w:sz="8" w:color="000000"/>
+              <w:bottom w:val="single" w:sz="8" w:color="000000"/>
+              <w:right w:val="single" w:sz="8" w:color="000000"/>
+            </w:tcBorders>
+            <w:tcMar>
+              <w:top w:type="dxa" w:w="60"/>
+              <w:left w:type="dxa" w:w="80"/>
+              <w:bottom w:type="dxa" w:w="70"/>
               <w:right w:type="dxa" w:w="80"/>
             </w:tcMar>
             <w:vAlign w:val="center"/>
@@ -1005,10 +1011,16 @@
         </w:tc>
         <w:tc>
           <w:tcPr>
-            <w:tcMar>
-              <w:top w:type="dxa" w:w="80"/>
-              <w:left w:type="dxa" w:w="80"/>
-              <w:bottom w:type="dxa" w:w="80"/>
+            <w:tcBorders>
+              <w:top w:val="single" w:sz="8" w:color="000000"/>
+              <w:left w:val="single" w:sz="8" w:color="000000"/>
+              <w:bottom w:val="single" w:sz="8" w:color="000000"/>
+              <w:right w:val="single" w:sz="8" w:color="000000"/>
+            </w:tcBorders>
+            <w:tcMar>
+              <w:top w:type="dxa" w:w="60"/>
+              <w:left w:type="dxa" w:w="80"/>
+              <w:bottom w:type="dxa" w:w="70"/>
               <w:right w:type="dxa" w:w="80"/>
             </w:tcMar>
             <w:vAlign w:val="center"/>
@@ -1032,10 +1044,16 @@
         </w:tc>
         <w:tc>
           <w:tcPr>
-            <w:tcMar>
-              <w:top w:type="dxa" w:w="80"/>
-              <w:left w:type="dxa" w:w="80"/>
-              <w:bottom w:type="dxa" w:w="80"/>
+            <w:tcBorders>
+              <w:top w:val="single" w:sz="8" w:color="000000"/>
+              <w:left w:val="single" w:sz="8" w:color="000000"/>
+              <w:bottom w:val="single" w:sz="8" w:color="000000"/>
+              <w:right w:val="single" w:sz="8" w:color="000000"/>
+            </w:tcBorders>
+            <w:tcMar>
+              <w:top w:type="dxa" w:w="60"/>
+              <w:left w:type="dxa" w:w="80"/>
+              <w:bottom w:type="dxa" w:w="70"/>
               <w:right w:type="dxa" w:w="80"/>
             </w:tcMar>
             <w:vAlign w:val="center"/>
@@ -1061,10 +1079,16 @@
       <w:tr>
         <w:tc>
           <w:tcPr>
-            <w:tcMar>
-              <w:top w:type="dxa" w:w="80"/>
-              <w:left w:type="dxa" w:w="80"/>
-              <w:bottom w:type="dxa" w:w="80"/>
+            <w:tcBorders>
+              <w:top w:val="single" w:sz="8" w:color="000000"/>
+              <w:left w:val="single" w:sz="8" w:color="000000"/>
+              <w:bottom w:val="single" w:sz="8" w:color="000000"/>
+              <w:right w:val="single" w:sz="8" w:color="000000"/>
+            </w:tcBorders>
+            <w:tcMar>
+              <w:top w:type="dxa" w:w="70"/>
+              <w:left w:type="dxa" w:w="80"/>
+              <w:bottom w:type="dxa" w:w="70"/>
               <w:right w:type="dxa" w:w="80"/>
             </w:tcMar>
             <w:vAlign w:val="center"/>
@@ -1088,10 +1112,16 @@
         </w:tc>
         <w:tc>
           <w:tcPr>
-            <w:tcMar>
-              <w:top w:type="dxa" w:w="80"/>
-              <w:left w:type="dxa" w:w="80"/>
-              <w:bottom w:type="dxa" w:w="80"/>
+            <w:tcBorders>
+              <w:top w:val="single" w:sz="8" w:color="000000"/>
+              <w:left w:val="single" w:sz="8" w:color="000000"/>
+              <w:bottom w:val="single" w:sz="8" w:color="000000"/>
+              <w:right w:val="single" w:sz="8" w:color="000000"/>
+            </w:tcBorders>
+            <w:tcMar>
+              <w:top w:type="dxa" w:w="70"/>
+              <w:left w:type="dxa" w:w="80"/>
+              <w:bottom w:type="dxa" w:w="70"/>
               <w:right w:type="dxa" w:w="80"/>
             </w:tcMar>
             <w:vAlign w:val="center"/>
@@ -1115,10 +1145,16 @@
         </w:tc>
         <w:tc>
           <w:tcPr>
-            <w:tcMar>
-              <w:top w:type="dxa" w:w="80"/>
-              <w:left w:type="dxa" w:w="80"/>
-              <w:bottom w:type="dxa" w:w="80"/>
+            <w:tcBorders>
+              <w:top w:val="single" w:sz="8" w:color="000000"/>
+              <w:left w:val="single" w:sz="8" w:color="000000"/>
+              <w:bottom w:val="single" w:sz="8" w:color="000000"/>
+              <w:right w:val="single" w:sz="8" w:color="000000"/>
+            </w:tcBorders>
+            <w:tcMar>
+              <w:top w:type="dxa" w:w="70"/>
+              <w:left w:type="dxa" w:w="80"/>
+              <w:bottom w:type="dxa" w:w="70"/>
               <w:right w:type="dxa" w:w="80"/>
             </w:tcMar>
             <w:vAlign w:val="center"/>
@@ -1144,10 +1180,16 @@
       <w:tr>
         <w:tc>
           <w:tcPr>
-            <w:tcMar>
-              <w:top w:type="dxa" w:w="80"/>
-              <w:left w:type="dxa" w:w="80"/>
-              <w:bottom w:type="dxa" w:w="80"/>
+            <w:tcBorders>
+              <w:top w:val="single" w:sz="8" w:color="000000"/>
+              <w:left w:val="single" w:sz="8" w:color="000000"/>
+              <w:bottom w:val="single" w:sz="8" w:color="000000"/>
+              <w:right w:val="single" w:sz="8" w:color="000000"/>
+            </w:tcBorders>
+            <w:tcMar>
+              <w:top w:type="dxa" w:w="70"/>
+              <w:left w:type="dxa" w:w="80"/>
+              <w:bottom w:type="dxa" w:w="70"/>
               <w:right w:type="dxa" w:w="80"/>
             </w:tcMar>
             <w:vAlign w:val="center"/>
@@ -1171,10 +1213,16 @@
         </w:tc>
         <w:tc>
           <w:tcPr>
-            <w:tcMar>
-              <w:top w:type="dxa" w:w="80"/>
-              <w:left w:type="dxa" w:w="80"/>
-              <w:bottom w:type="dxa" w:w="80"/>
+            <w:tcBorders>
+              <w:top w:val="single" w:sz="8" w:color="000000"/>
+              <w:left w:val="single" w:sz="8" w:color="000000"/>
+              <w:bottom w:val="single" w:sz="8" w:color="000000"/>
+              <w:right w:val="single" w:sz="8" w:color="000000"/>
+            </w:tcBorders>
+            <w:tcMar>
+              <w:top w:type="dxa" w:w="70"/>
+              <w:left w:type="dxa" w:w="80"/>
+              <w:bottom w:type="dxa" w:w="70"/>
               <w:right w:type="dxa" w:w="80"/>
             </w:tcMar>
             <w:vAlign w:val="center"/>
@@ -1198,10 +1246,16 @@
         </w:tc>
         <w:tc>
           <w:tcPr>
-            <w:tcMar>
-              <w:top w:type="dxa" w:w="80"/>
-              <w:left w:type="dxa" w:w="80"/>
-              <w:bottom w:type="dxa" w:w="80"/>
+            <w:tcBorders>
+              <w:top w:val="single" w:sz="8" w:color="000000"/>
+              <w:left w:val="single" w:sz="8" w:color="000000"/>
+              <w:bottom w:val="single" w:sz="8" w:color="000000"/>
+              <w:right w:val="single" w:sz="8" w:color="000000"/>
+            </w:tcBorders>
+            <w:tcMar>
+              <w:top w:type="dxa" w:w="70"/>
+              <w:left w:type="dxa" w:w="80"/>
+              <w:bottom w:type="dxa" w:w="70"/>
               <w:right w:type="dxa" w:w="80"/>
             </w:tcMar>
             <w:vAlign w:val="center"/>
@@ -1227,10 +1281,16 @@
       <w:tr>
         <w:tc>
           <w:tcPr>
-            <w:tcMar>
-              <w:top w:type="dxa" w:w="80"/>
-              <w:left w:type="dxa" w:w="80"/>
-              <w:bottom w:type="dxa" w:w="80"/>
+            <w:tcBorders>
+              <w:top w:val="single" w:sz="8" w:color="000000"/>
+              <w:left w:val="single" w:sz="8" w:color="000000"/>
+              <w:bottom w:val="single" w:sz="8" w:color="000000"/>
+              <w:right w:val="single" w:sz="8" w:color="000000"/>
+            </w:tcBorders>
+            <w:tcMar>
+              <w:top w:type="dxa" w:w="70"/>
+              <w:left w:type="dxa" w:w="80"/>
+              <w:bottom w:type="dxa" w:w="70"/>
               <w:right w:type="dxa" w:w="80"/>
             </w:tcMar>
             <w:vAlign w:val="center"/>
@@ -1254,10 +1314,16 @@
         </w:tc>
         <w:tc>
           <w:tcPr>
-            <w:tcMar>
-              <w:top w:type="dxa" w:w="80"/>
-              <w:left w:type="dxa" w:w="80"/>
-              <w:bottom w:type="dxa" w:w="80"/>
+            <w:tcBorders>
+              <w:top w:val="single" w:sz="8" w:color="000000"/>
+              <w:left w:val="single" w:sz="8" w:color="000000"/>
+              <w:bottom w:val="single" w:sz="8" w:color="000000"/>
+              <w:right w:val="single" w:sz="8" w:color="000000"/>
+            </w:tcBorders>
+            <w:tcMar>
+              <w:top w:type="dxa" w:w="70"/>
+              <w:left w:type="dxa" w:w="80"/>
+              <w:bottom w:type="dxa" w:w="70"/>
               <w:right w:type="dxa" w:w="80"/>
             </w:tcMar>
             <w:vAlign w:val="center"/>
@@ -1281,10 +1347,16 @@
         </w:tc>
         <w:tc>
           <w:tcPr>
-            <w:tcMar>
-              <w:top w:type="dxa" w:w="80"/>
-              <w:left w:type="dxa" w:w="80"/>
-              <w:bottom w:type="dxa" w:w="80"/>
+            <w:tcBorders>
+              <w:top w:val="single" w:sz="8" w:color="000000"/>
+              <w:left w:val="single" w:sz="8" w:color="000000"/>
+              <w:bottom w:val="single" w:sz="8" w:color="000000"/>
+              <w:right w:val="single" w:sz="8" w:color="000000"/>
+            </w:tcBorders>
+            <w:tcMar>
+              <w:top w:type="dxa" w:w="70"/>
+              <w:left w:type="dxa" w:w="80"/>
+              <w:bottom w:type="dxa" w:w="70"/>
               <w:right w:type="dxa" w:w="80"/>
             </w:tcMar>
             <w:vAlign w:val="center"/>
@@ -1310,10 +1382,16 @@
       <w:tr>
         <w:tc>
           <w:tcPr>
-            <w:tcMar>
-              <w:top w:type="dxa" w:w="80"/>
-              <w:left w:type="dxa" w:w="80"/>
-              <w:bottom w:type="dxa" w:w="80"/>
+            <w:tcBorders>
+              <w:top w:val="single" w:sz="8" w:color="000000"/>
+              <w:left w:val="single" w:sz="8" w:color="000000"/>
+              <w:bottom w:val="single" w:sz="8" w:color="000000"/>
+              <w:right w:val="single" w:sz="8" w:color="000000"/>
+            </w:tcBorders>
+            <w:tcMar>
+              <w:top w:type="dxa" w:w="70"/>
+              <w:left w:type="dxa" w:w="80"/>
+              <w:bottom w:type="dxa" w:w="60"/>
               <w:right w:type="dxa" w:w="80"/>
             </w:tcMar>
             <w:vAlign w:val="center"/>
@@ -1337,10 +1415,16 @@
         </w:tc>
         <w:tc>
           <w:tcPr>
-            <w:tcMar>
-              <w:top w:type="dxa" w:w="80"/>
-              <w:left w:type="dxa" w:w="80"/>
-              <w:bottom w:type="dxa" w:w="80"/>
+            <w:tcBorders>
+              <w:top w:val="single" w:sz="8" w:color="000000"/>
+              <w:left w:val="single" w:sz="8" w:color="000000"/>
+              <w:bottom w:val="single" w:sz="8" w:color="000000"/>
+              <w:right w:val="single" w:sz="8" w:color="000000"/>
+            </w:tcBorders>
+            <w:tcMar>
+              <w:top w:type="dxa" w:w="70"/>
+              <w:left w:type="dxa" w:w="80"/>
+              <w:bottom w:type="dxa" w:w="60"/>
               <w:right w:type="dxa" w:w="80"/>
             </w:tcMar>
             <w:vAlign w:val="center"/>
@@ -1364,10 +1448,16 @@
         </w:tc>
         <w:tc>
           <w:tcPr>
-            <w:tcMar>
-              <w:top w:type="dxa" w:w="80"/>
-              <w:left w:type="dxa" w:w="80"/>
-              <w:bottom w:type="dxa" w:w="80"/>
+            <w:tcBorders>
+              <w:top w:val="single" w:sz="8" w:color="000000"/>
+              <w:left w:val="single" w:sz="8" w:color="000000"/>
+              <w:bottom w:val="single" w:sz="8" w:color="000000"/>
+              <w:right w:val="single" w:sz="8" w:color="000000"/>
+            </w:tcBorders>
+            <w:tcMar>
+              <w:top w:type="dxa" w:w="70"/>
+              <w:left w:type="dxa" w:w="80"/>
+              <w:bottom w:type="dxa" w:w="60"/>
               <w:right w:type="dxa" w:w="80"/>
             </w:tcMar>
             <w:vAlign w:val="center"/>

</xml_diff>

<commit_message>
fix(docx): give a ruled table's first row half its next row's rule, hold a row its rules fill at a twip, and re-render the Word preview
</commit_message>
<xml_diff>
--- a/assets/readme/examples/word-export-companion.docx
+++ b/assets/readme/examples/word-export-companion.docx
@@ -241,7 +241,7 @@
       </w:tblGrid>
       <w:tr>
         <w:trPr>
-          <w:trHeight w:val="266" w:hRule="atLeast"/>
+          <w:trHeight w:val="258" w:hRule="atLeast"/>
           <w:cantSplit w:val="on"/>
         </w:trPr>
         <w:tc>
@@ -628,7 +628,7 @@
       </w:tr>
       <w:tr>
         <w:trPr>
-          <w:trHeight w:val="266" w:hRule="atLeast"/>
+          <w:trHeight w:val="258" w:hRule="atLeast"/>
           <w:cantSplit w:val="on"/>
         </w:trPr>
         <w:tc>

</xml_diff>

<commit_message>
fix(docx): hold a ruled table's first and last rows less the rule and a half they carry (#829)
* fix(docx): hold a ruled table's first and last rows less the rule and a half they carry

* fix(docx): give a ruled table's first row half its next row's rule, hold a row its rules fill at a twip, and re-render the Word preview
</commit_message>
<xml_diff>
--- a/assets/readme/examples/word-export-companion.docx
+++ b/assets/readme/examples/word-export-companion.docx
@@ -241,7 +241,7 @@
       </w:tblGrid>
       <w:tr>
         <w:trPr>
-          <w:trHeight w:val="266" w:hRule="atLeast"/>
+          <w:trHeight w:val="258" w:hRule="atLeast"/>
           <w:cantSplit w:val="on"/>
         </w:trPr>
         <w:tc>
@@ -628,7 +628,7 @@
       </w:tr>
       <w:tr>
         <w:trPr>
-          <w:trHeight w:val="266" w:hRule="atLeast"/>
+          <w:trHeight w:val="258" w:hRule="atLeast"/>
           <w:cantSplit w:val="on"/>
         </w:trPr>
         <w:tc>

</xml_diff>

<commit_message>
fix(docx): wrap a list without hangingIndent where the page does, its marker a space ahead
The page sets such an item's first line as the marker, a space and the
text, and every wrapped line after the spaces covering the marker; the
Word list's levels were a stated 9pt column with a tab. The top level of a
placed list that does not nest now takes the width of those spaces in the
list's style as its indent and hanging, w:suff="space", the level in the
list's face and size. An item that wraps is measured at Word's half-point
size, less a point and never short of its widest line, so it breaks at the
page's words.

Lines more than 2pt off across fall from 72 to 49 in Word and from 77 to
54 in LibreOffice; nothing moves down.
</commit_message>
<xml_diff>
--- a/assets/readme/examples/word-export-companion.docx
+++ b/assets/readme/examples/word-export-companion.docx
@@ -1533,11 +1533,18 @@
     <w:lvl w:ilvl="0">
       <w:start w:val="1"/>
       <w:numFmt w:val="bullet"/>
+      <w:suff w:val="space"/>
       <w:lvlText w:val="-"/>
       <w:lvlJc w:val="left"/>
       <w:pPr>
-        <w:ind w:left="180" w:hanging="180"/>
-      </w:pPr>
+        <w:ind w:left="183" w:hanging="183"/>
+      </w:pPr>
+      <w:rPr>
+        <w:rFonts w:ascii="Helvetica" w:hAnsi="Helvetica" w:cs="Helvetica" w:eastAsia="Helvetica"/>
+        <w:sz w:val="22"/>
+        <w:szCs w:val="22"/>
+        <w:color w:val="222632"/>
+      </w:rPr>
     </w:lvl>
   </w:abstractNum>
   <w:abstractNum w:abstractNumId="1">

</xml_diff>

<commit_message>
docs(docx): record that a paragraph's mark carries what its text ends in, and re-render the Word export preview
</commit_message>
<xml_diff>
--- a/assets/readme/examples/word-export-companion.docx
+++ b/assets/readme/examples/word-export-companion.docx
@@ -6,6 +6,13 @@
       <w:pPr>
         <w:spacing w:lineRule="exact" w:line="370"/>
         <w:jc w:val="left"/>
+        <w:rPr>
+          <w:b w:val="on"/>
+          <w:bCs w:val="on"/>
+          <w:color w:val="142D50"/>
+          <w:sz w:val="40"/>
+          <w:szCs w:val="40"/>
+        </w:rPr>
       </w:pPr>
       <w:r>
         <w:rPr>
@@ -22,6 +29,11 @@
       <w:pPr>
         <w:spacing w:before="280" w:lineRule="exact" w:line="259"/>
         <w:jc w:val="left"/>
+        <w:rPr>
+          <w:color w:val="000000"/>
+          <w:sz w:val="28"/>
+          <w:szCs w:val="28"/>
+        </w:rPr>
       </w:pPr>
       <w:r>
         <w:rPr>
@@ -108,6 +120,13 @@
       <w:pPr>
         <w:spacing w:before="280" w:lineRule="exact" w:line="241"/>
         <w:jc w:val="left"/>
+        <w:rPr>
+          <w:b w:val="on"/>
+          <w:bCs w:val="on"/>
+          <w:color w:val="222632"/>
+          <w:sz w:val="26"/>
+          <w:szCs w:val="26"/>
+        </w:rPr>
       </w:pPr>
       <w:r>
         <w:rPr>
@@ -127,6 +146,11 @@
           <w:numId w:val="1"/>
         </w:numPr>
         <w:spacing w:before="280" w:lineRule="exact" w:line="203"/>
+        <w:rPr>
+          <w:color w:val="222632"/>
+          <w:sz w:val="22"/>
+          <w:szCs w:val="22"/>
+        </w:rPr>
       </w:pPr>
       <w:r>
         <w:rPr>
@@ -144,6 +168,11 @@
           <w:numId w:val="1"/>
         </w:numPr>
         <w:spacing w:lineRule="exact" w:line="203"/>
+        <w:rPr>
+          <w:color w:val="222632"/>
+          <w:sz w:val="22"/>
+          <w:szCs w:val="22"/>
+        </w:rPr>
       </w:pPr>
       <w:r>
         <w:rPr>
@@ -161,6 +190,11 @@
           <w:numId w:val="2"/>
         </w:numPr>
         <w:spacing w:before="280" w:lineRule="exact" w:line="203"/>
+        <w:rPr>
+          <w:color w:val="222632"/>
+          <w:sz w:val="22"/>
+          <w:szCs w:val="22"/>
+        </w:rPr>
       </w:pPr>
       <w:r>
         <w:rPr>
@@ -178,6 +212,11 @@
           <w:numId w:val="2"/>
         </w:numPr>
         <w:spacing w:before="40" w:lineRule="exact" w:line="203"/>
+        <w:rPr>
+          <w:color w:val="222632"/>
+          <w:sz w:val="22"/>
+          <w:szCs w:val="22"/>
+        </w:rPr>
       </w:pPr>
       <w:r>
         <w:rPr>
@@ -195,11 +234,16 @@
           <w:numId w:val="2"/>
         </w:numPr>
         <w:spacing w:before="40" w:lineRule="exact" w:line="203"/>
-      </w:pPr>
-      <w:r>
-        <w:rPr>
+        <w:rPr>
+          <w:color w:val="222632"/>
           <w:sz w:val="22"/>
           <w:szCs w:val="22"/>
+        </w:rPr>
+      </w:pPr>
+      <w:r>
+        <w:rPr>
+          <w:sz w:val="22"/>
+          <w:szCs w:val="22"/>
           <w:color w:val="222632"/>
         </w:rPr>
         <w:t>Custom markers survive the export</w:t>
@@ -209,6 +253,13 @@
       <w:pPr>
         <w:spacing w:before="280" w:lineRule="exact" w:line="241" w:after="280"/>
         <w:jc w:val="left"/>
+        <w:rPr>
+          <w:b w:val="on"/>
+          <w:bCs w:val="on"/>
+          <w:color w:val="222632"/>
+          <w:sz w:val="26"/>
+          <w:szCs w:val="26"/>
+        </w:rPr>
       </w:pPr>
       <w:r>
         <w:rPr>
@@ -264,6 +315,11 @@
           <w:p>
             <w:pPr>
               <w:spacing w:lineRule="exact" w:line="259"/>
+              <w:rPr>
+                <w:color w:val="000000"/>
+                <w:sz w:val="28"/>
+                <w:szCs w:val="28"/>
+              </w:rPr>
             </w:pPr>
             <w:r>
               <w:rPr>
@@ -295,6 +351,11 @@
           <w:p>
             <w:pPr>
               <w:spacing w:lineRule="exact" w:line="259"/>
+              <w:rPr>
+                <w:color w:val="000000"/>
+                <w:sz w:val="28"/>
+                <w:szCs w:val="28"/>
+              </w:rPr>
             </w:pPr>
             <w:r>
               <w:rPr>
@@ -326,6 +387,11 @@
           <w:p>
             <w:pPr>
               <w:spacing w:lineRule="exact" w:line="259"/>
+              <w:rPr>
+                <w:color w:val="000000"/>
+                <w:sz w:val="28"/>
+                <w:szCs w:val="28"/>
+              </w:rPr>
             </w:pPr>
             <w:r>
               <w:rPr>
@@ -362,6 +428,11 @@
           <w:p>
             <w:pPr>
               <w:spacing w:lineRule="exact" w:line="259"/>
+              <w:rPr>
+                <w:color w:val="000000"/>
+                <w:sz w:val="28"/>
+                <w:szCs w:val="28"/>
+              </w:rPr>
             </w:pPr>
             <w:r>
               <w:rPr>
@@ -392,6 +463,11 @@
           <w:p>
             <w:pPr>
               <w:spacing w:lineRule="exact" w:line="259"/>
+              <w:rPr>
+                <w:color w:val="000000"/>
+                <w:sz w:val="28"/>
+                <w:szCs w:val="28"/>
+              </w:rPr>
             </w:pPr>
             <w:r>
               <w:rPr>
@@ -422,6 +498,11 @@
           <w:p>
             <w:pPr>
               <w:spacing w:lineRule="exact" w:line="259"/>
+              <w:rPr>
+                <w:color w:val="000000"/>
+                <w:sz w:val="28"/>
+                <w:szCs w:val="28"/>
+              </w:rPr>
             </w:pPr>
             <w:r>
               <w:rPr>
@@ -458,6 +539,11 @@
           <w:p>
             <w:pPr>
               <w:spacing w:lineRule="exact" w:line="259"/>
+              <w:rPr>
+                <w:color w:val="000000"/>
+                <w:sz w:val="28"/>
+                <w:szCs w:val="28"/>
+              </w:rPr>
             </w:pPr>
             <w:r>
               <w:rPr>
@@ -488,6 +574,11 @@
           <w:p>
             <w:pPr>
               <w:spacing w:lineRule="exact" w:line="259"/>
+              <w:rPr>
+                <w:color w:val="000000"/>
+                <w:sz w:val="28"/>
+                <w:szCs w:val="28"/>
+              </w:rPr>
             </w:pPr>
             <w:r>
               <w:rPr>
@@ -518,6 +609,11 @@
           <w:p>
             <w:pPr>
               <w:spacing w:lineRule="exact" w:line="259"/>
+              <w:rPr>
+                <w:color w:val="000000"/>
+                <w:sz w:val="28"/>
+                <w:szCs w:val="28"/>
+              </w:rPr>
             </w:pPr>
             <w:r>
               <w:rPr>
@@ -554,6 +650,11 @@
           <w:p>
             <w:pPr>
               <w:spacing w:lineRule="exact" w:line="259"/>
+              <w:rPr>
+                <w:color w:val="000000"/>
+                <w:sz w:val="28"/>
+                <w:szCs w:val="28"/>
+              </w:rPr>
             </w:pPr>
             <w:r>
               <w:rPr>
@@ -584,6 +685,11 @@
           <w:p>
             <w:pPr>
               <w:spacing w:lineRule="exact" w:line="259"/>
+              <w:rPr>
+                <w:color w:val="000000"/>
+                <w:sz w:val="28"/>
+                <w:szCs w:val="28"/>
+              </w:rPr>
             </w:pPr>
             <w:r>
               <w:rPr>
@@ -614,6 +720,11 @@
           <w:p>
             <w:pPr>
               <w:spacing w:lineRule="exact" w:line="259"/>
+              <w:rPr>
+                <w:color w:val="000000"/>
+                <w:sz w:val="28"/>
+                <w:szCs w:val="28"/>
+              </w:rPr>
             </w:pPr>
             <w:r>
               <w:rPr>
@@ -650,6 +761,11 @@
           <w:p>
             <w:pPr>
               <w:spacing w:lineRule="exact" w:line="259"/>
+              <w:rPr>
+                <w:color w:val="000000"/>
+                <w:sz w:val="28"/>
+                <w:szCs w:val="28"/>
+              </w:rPr>
             </w:pPr>
             <w:r>
               <w:rPr>
@@ -680,6 +796,11 @@
           <w:p>
             <w:pPr>
               <w:spacing w:lineRule="exact" w:line="259"/>
+              <w:rPr>
+                <w:color w:val="000000"/>
+                <w:sz w:val="28"/>
+                <w:szCs w:val="28"/>
+              </w:rPr>
             </w:pPr>
             <w:r>
               <w:rPr>
@@ -710,6 +831,11 @@
           <w:p>
             <w:pPr>
               <w:spacing w:lineRule="exact" w:line="259"/>
+              <w:rPr>
+                <w:color w:val="000000"/>
+                <w:sz w:val="28"/>
+                <w:szCs w:val="28"/>
+              </w:rPr>
             </w:pPr>
             <w:r>
               <w:rPr>
@@ -727,6 +853,13 @@
       <w:pPr>
         <w:spacing w:before="280" w:lineRule="exact" w:line="241" w:after="280"/>
         <w:jc w:val="left"/>
+        <w:rPr>
+          <w:b w:val="on"/>
+          <w:bCs w:val="on"/>
+          <w:color w:val="222632"/>
+          <w:sz w:val="26"/>
+          <w:szCs w:val="26"/>
+        </w:rPr>
       </w:pPr>
       <w:r>
         <w:rPr>
@@ -772,6 +905,11 @@
             <w:pPr>
               <w:spacing w:lineRule="exact" w:line="203"/>
               <w:jc w:val="left"/>
+              <w:rPr>
+                <w:color w:val="222632"/>
+                <w:sz w:val="22"/>
+                <w:szCs w:val="22"/>
+              </w:rPr>
             </w:pPr>
             <w:r>
               <w:rPr>
@@ -795,6 +933,11 @@
             <w:pPr>
               <w:spacing w:lineRule="exact" w:line="203"/>
               <w:jc w:val="left"/>
+              <w:rPr>
+                <w:color w:val="222632"/>
+                <w:sz w:val="22"/>
+                <w:szCs w:val="22"/>
+              </w:rPr>
             </w:pPr>
             <w:r>
               <w:rPr>
@@ -812,6 +955,13 @@
       <w:pPr>
         <w:spacing w:before="280" w:lineRule="exact" w:line="241"/>
         <w:jc w:val="left"/>
+        <w:rPr>
+          <w:b w:val="on"/>
+          <w:bCs w:val="on"/>
+          <w:color w:val="222632"/>
+          <w:sz w:val="26"/>
+          <w:szCs w:val="26"/>
+        </w:rPr>
       </w:pPr>
       <w:r>
         <w:rPr>
@@ -873,6 +1023,13 @@
       <w:pPr>
         <w:spacing w:before="280" w:lineRule="exact" w:line="241"/>
         <w:jc w:val="left"/>
+        <w:rPr>
+          <w:b w:val="on"/>
+          <w:bCs w:val="on"/>
+          <w:color w:val="222632"/>
+          <w:sz w:val="26"/>
+          <w:szCs w:val="26"/>
+        </w:rPr>
       </w:pPr>
       <w:r>
         <w:drawing xmlns:a="http://schemas.openxmlformats.org/drawingml/2006/main" xmlns:wps="http://schemas.microsoft.com/office/word/2010/wordprocessingShape">
@@ -954,6 +1111,10 @@
       <w:pPr>
         <w:spacing w:before="280" w:lineRule="exact" w:line="185" w:after="280"/>
         <w:jc w:val="left"/>
+        <w:rPr>
+          <w:i w:val="on"/>
+          <w:iCs w:val="on"/>
+        </w:rPr>
       </w:pPr>
       <w:r>
         <w:rPr>
@@ -995,6 +1156,7 @@
           <w:p>
             <w:pPr>
               <w:rPr>
+                <w:color w:val="000000"/>
                 <w:sz w:val="28"/>
                 <w:szCs w:val="28"/>
               </w:rPr>
@@ -1028,6 +1190,7 @@
           <w:p>
             <w:pPr>
               <w:rPr>
+                <w:color w:val="000000"/>
                 <w:sz w:val="28"/>
                 <w:szCs w:val="28"/>
               </w:rPr>
@@ -1061,6 +1224,7 @@
           <w:p>
             <w:pPr>
               <w:rPr>
+                <w:color w:val="000000"/>
                 <w:sz w:val="28"/>
                 <w:szCs w:val="28"/>
               </w:rPr>
@@ -1096,6 +1260,7 @@
           <w:p>
             <w:pPr>
               <w:rPr>
+                <w:color w:val="000000"/>
                 <w:sz w:val="28"/>
                 <w:szCs w:val="28"/>
               </w:rPr>
@@ -1129,6 +1294,7 @@
           <w:p>
             <w:pPr>
               <w:rPr>
+                <w:color w:val="000000"/>
                 <w:sz w:val="28"/>
                 <w:szCs w:val="28"/>
               </w:rPr>
@@ -1162,6 +1328,7 @@
           <w:p>
             <w:pPr>
               <w:rPr>
+                <w:color w:val="000000"/>
                 <w:sz w:val="28"/>
                 <w:szCs w:val="28"/>
               </w:rPr>
@@ -1197,6 +1364,7 @@
           <w:p>
             <w:pPr>
               <w:rPr>
+                <w:color w:val="000000"/>
                 <w:sz w:val="28"/>
                 <w:szCs w:val="28"/>
               </w:rPr>
@@ -1230,6 +1398,7 @@
           <w:p>
             <w:pPr>
               <w:rPr>
+                <w:color w:val="000000"/>
                 <w:sz w:val="28"/>
                 <w:szCs w:val="28"/>
               </w:rPr>
@@ -1263,6 +1432,7 @@
           <w:p>
             <w:pPr>
               <w:rPr>
+                <w:color w:val="000000"/>
                 <w:sz w:val="28"/>
                 <w:szCs w:val="28"/>
               </w:rPr>
@@ -1298,6 +1468,7 @@
           <w:p>
             <w:pPr>
               <w:rPr>
+                <w:color w:val="000000"/>
                 <w:sz w:val="28"/>
                 <w:szCs w:val="28"/>
               </w:rPr>
@@ -1331,6 +1502,7 @@
           <w:p>
             <w:pPr>
               <w:rPr>
+                <w:color w:val="000000"/>
                 <w:sz w:val="28"/>
                 <w:szCs w:val="28"/>
               </w:rPr>
@@ -1364,6 +1536,7 @@
           <w:p>
             <w:pPr>
               <w:rPr>
+                <w:color w:val="000000"/>
                 <w:sz w:val="28"/>
                 <w:szCs w:val="28"/>
               </w:rPr>
@@ -1399,6 +1572,7 @@
           <w:p>
             <w:pPr>
               <w:rPr>
+                <w:color w:val="000000"/>
                 <w:sz w:val="28"/>
                 <w:szCs w:val="28"/>
               </w:rPr>
@@ -1432,6 +1606,7 @@
           <w:p>
             <w:pPr>
               <w:rPr>
+                <w:color w:val="000000"/>
                 <w:sz w:val="28"/>
                 <w:szCs w:val="28"/>
               </w:rPr>
@@ -1465,6 +1640,7 @@
           <w:p>
             <w:pPr>
               <w:rPr>
+                <w:color w:val="000000"/>
                 <w:sz w:val="28"/>
                 <w:szCs w:val="28"/>
               </w:rPr>
@@ -1485,11 +1661,18 @@
       <w:pPr>
         <w:spacing w:before="280" w:lineRule="exact" w:line="241"/>
         <w:jc w:val="left"/>
-      </w:pPr>
-      <w:r>
-        <w:rPr>
+        <w:rPr>
+          <w:b w:val="on"/>
+          <w:bCs w:val="on"/>
+          <w:color w:val="222632"/>
           <w:sz w:val="26"/>
           <w:szCs w:val="26"/>
+        </w:rPr>
+      </w:pPr>
+      <w:r>
+        <w:rPr>
+          <w:sz w:val="26"/>
+          <w:szCs w:val="26"/>
           <w:color w:val="222632"/>
           <w:b w:val="on"/>
           <w:bCs w:val="on"/>
@@ -1501,6 +1684,10 @@
       <w:pPr>
         <w:spacing w:before="280" w:lineRule="exact" w:line="185"/>
         <w:jc w:val="left"/>
+        <w:rPr>
+          <w:i w:val="on"/>
+          <w:iCs w:val="on"/>
+        </w:rPr>
       </w:pPr>
       <w:r>
         <w:rPr>

</xml_diff>

<commit_message>
fix(docx): keep a cell's text off its rule when its margin gives the slack
- A side of a text cell gives an auto column's slack only past the
  inner half of the cell's rule, as wide as Word draws it: taken
  further, a line an editor's face sets wider would run onto the rule.
  What it cannot give widens the column, named (right end).
- Re-render the Word export example's DOCX preview: its quarterly
  table's three auto columns are a point narrower each, the point in
  their cells' right margins.
- Tests: a 1pt padding beside a 1pt rule gives half a point; a cell
  spanning two rows gives the point in the merge's covered position;
  the thin-padding tests are unruled.
</commit_message>
<xml_diff>
--- a/assets/readme/examples/word-export-companion.docx
+++ b/assets/readme/examples/word-export-companion.docx
@@ -274,7 +274,7 @@
     </w:p>
     <w:tbl>
       <w:tblPr>
-        <w:tblW w:w="3263" w:type="dxa"/>
+        <w:tblW w:w="3203" w:type="dxa"/>
         <w:tblBorders>
           <w:top w:val="single"/>
           <w:left w:val="single"/>
@@ -286,9 +286,9 @@
         <w:tblLayout w:type="fixed"/>
       </w:tblPr>
       <w:tblGrid>
-        <w:gridCol w:w="1129"/>
-        <w:gridCol w:w="1301"/>
-        <w:gridCol w:w="833"/>
+        <w:gridCol w:w="1109"/>
+        <w:gridCol w:w="1281"/>
+        <w:gridCol w:w="813"/>
       </w:tblGrid>
       <w:tr>
         <w:trPr>
@@ -308,7 +308,7 @@
               <w:top w:type="dxa" w:w="59"/>
               <w:left w:type="dxa" w:w="80"/>
               <w:bottom w:type="dxa" w:w="79"/>
-              <w:right w:type="dxa" w:w="80"/>
+              <w:right w:type="dxa" w:w="60"/>
             </w:tcMar>
             <w:vAlign w:val="center"/>
           </w:tcPr>
@@ -344,7 +344,7 @@
               <w:top w:type="dxa" w:w="59"/>
               <w:left w:type="dxa" w:w="80"/>
               <w:bottom w:type="dxa" w:w="79"/>
-              <w:right w:type="dxa" w:w="80"/>
+              <w:right w:type="dxa" w:w="60"/>
             </w:tcMar>
             <w:vAlign w:val="center"/>
           </w:tcPr>
@@ -380,7 +380,7 @@
               <w:top w:type="dxa" w:w="59"/>
               <w:left w:type="dxa" w:w="80"/>
               <w:bottom w:type="dxa" w:w="79"/>
-              <w:right w:type="dxa" w:w="80"/>
+              <w:right w:type="dxa" w:w="60"/>
             </w:tcMar>
             <w:vAlign w:val="center"/>
           </w:tcPr>
@@ -421,7 +421,7 @@
               <w:top w:type="dxa" w:w="66"/>
               <w:left w:type="dxa" w:w="80"/>
               <w:bottom w:type="dxa" w:w="79"/>
-              <w:right w:type="dxa" w:w="80"/>
+              <w:right w:type="dxa" w:w="60"/>
             </w:tcMar>
             <w:vAlign w:val="center"/>
           </w:tcPr>
@@ -456,7 +456,7 @@
               <w:top w:type="dxa" w:w="66"/>
               <w:left w:type="dxa" w:w="80"/>
               <w:bottom w:type="dxa" w:w="79"/>
-              <w:right w:type="dxa" w:w="80"/>
+              <w:right w:type="dxa" w:w="60"/>
             </w:tcMar>
             <w:vAlign w:val="center"/>
           </w:tcPr>
@@ -491,7 +491,7 @@
               <w:top w:type="dxa" w:w="66"/>
               <w:left w:type="dxa" w:w="80"/>
               <w:bottom w:type="dxa" w:w="79"/>
-              <w:right w:type="dxa" w:w="80"/>
+              <w:right w:type="dxa" w:w="60"/>
             </w:tcMar>
             <w:vAlign w:val="center"/>
           </w:tcPr>
@@ -532,7 +532,7 @@
               <w:top w:type="dxa" w:w="66"/>
               <w:left w:type="dxa" w:w="80"/>
               <w:bottom w:type="dxa" w:w="79"/>
-              <w:right w:type="dxa" w:w="80"/>
+              <w:right w:type="dxa" w:w="60"/>
             </w:tcMar>
             <w:vAlign w:val="center"/>
           </w:tcPr>
@@ -567,7 +567,7 @@
               <w:top w:type="dxa" w:w="66"/>
               <w:left w:type="dxa" w:w="80"/>
               <w:bottom w:type="dxa" w:w="79"/>
-              <w:right w:type="dxa" w:w="80"/>
+              <w:right w:type="dxa" w:w="60"/>
             </w:tcMar>
             <w:vAlign w:val="center"/>
           </w:tcPr>
@@ -602,7 +602,7 @@
               <w:top w:type="dxa" w:w="66"/>
               <w:left w:type="dxa" w:w="80"/>
               <w:bottom w:type="dxa" w:w="79"/>
-              <w:right w:type="dxa" w:w="80"/>
+              <w:right w:type="dxa" w:w="60"/>
             </w:tcMar>
             <w:vAlign w:val="center"/>
           </w:tcPr>
@@ -643,7 +643,7 @@
               <w:top w:type="dxa" w:w="66"/>
               <w:left w:type="dxa" w:w="80"/>
               <w:bottom w:type="dxa" w:w="79"/>
-              <w:right w:type="dxa" w:w="80"/>
+              <w:right w:type="dxa" w:w="60"/>
             </w:tcMar>
             <w:vAlign w:val="center"/>
           </w:tcPr>
@@ -678,7 +678,7 @@
               <w:top w:type="dxa" w:w="66"/>
               <w:left w:type="dxa" w:w="80"/>
               <w:bottom w:type="dxa" w:w="79"/>
-              <w:right w:type="dxa" w:w="80"/>
+              <w:right w:type="dxa" w:w="60"/>
             </w:tcMar>
             <w:vAlign w:val="center"/>
           </w:tcPr>
@@ -713,7 +713,7 @@
               <w:top w:type="dxa" w:w="66"/>
               <w:left w:type="dxa" w:w="80"/>
               <w:bottom w:type="dxa" w:w="79"/>
-              <w:right w:type="dxa" w:w="80"/>
+              <w:right w:type="dxa" w:w="60"/>
             </w:tcMar>
             <w:vAlign w:val="center"/>
           </w:tcPr>
@@ -754,7 +754,7 @@
               <w:top w:type="dxa" w:w="66"/>
               <w:left w:type="dxa" w:w="80"/>
               <w:bottom w:type="dxa" w:w="71"/>
-              <w:right w:type="dxa" w:w="80"/>
+              <w:right w:type="dxa" w:w="60"/>
             </w:tcMar>
             <w:vAlign w:val="center"/>
           </w:tcPr>
@@ -789,7 +789,7 @@
               <w:top w:type="dxa" w:w="66"/>
               <w:left w:type="dxa" w:w="80"/>
               <w:bottom w:type="dxa" w:w="71"/>
-              <w:right w:type="dxa" w:w="80"/>
+              <w:right w:type="dxa" w:w="60"/>
             </w:tcMar>
             <w:vAlign w:val="center"/>
           </w:tcPr>
@@ -824,7 +824,7 @@
               <w:top w:type="dxa" w:w="66"/>
               <w:left w:type="dxa" w:w="80"/>
               <w:bottom w:type="dxa" w:w="71"/>
-              <w:right w:type="dxa" w:w="80"/>
+              <w:right w:type="dxa" w:w="60"/>
             </w:tcMar>
             <w:vAlign w:val="center"/>
           </w:tcPr>

</xml_diff>